<commit_message>
Expand How-To guide doc with full platform walkthrough
Covers public site vs staff app, login, intake, pipeline, mail-first
outreach, DNC texts, intel sync, admin setup, and daily workflow.
</commit_message>
<xml_diff>
--- a/docs/Barn-to-Bank-How-To.docx
+++ b/docs/Barn-to-Bank-How-To.docx
@@ -19,7 +19,7 @@
     </w:p>
     <w:p>
       <w:pPr>
-        <w:spacing w:after="200"/>
+        <w:spacing w:after="120"/>
       </w:pPr>
       <w:r>
         <w:rPr>
@@ -27,33 +27,417 @@
           <w:sz w:val="28"/>
           <w:szCs w:val="28"/>
         </w:rPr>
-        <w:t xml:space="preserve">How-To Guide</w:t>
-      </w:r>
-    </w:p>
-    <w:p>
-      <w:pPr>
-        <w:spacing w:after="240"/>
-      </w:pPr>
-      <w:r>
-        <w:t xml:space="preserve">Live app: </w:t>
-      </w:r>
-      <w:hyperlink w:history="1" r:id="rIdoedzxgocwlqidw6bmtzic">
+        <w:t xml:space="preserve">Complete How-To Guide</w:t>
+      </w:r>
+    </w:p>
+    <w:p>
+      <w:pPr>
+        <w:spacing w:after="60"/>
+      </w:pPr>
+      <w:r>
+        <w:t xml:space="preserve">Staff app: </w:t>
+      </w:r>
+      <w:hyperlink w:history="1" r:id="rId0dghxq2x6di7qpbhozkp-">
         <w:r>
           <w:rPr>
             <w:rStyle w:val="Hyperlink"/>
             <w:color w:val="0563C1"/>
             <w:u w:val="single"/>
           </w:rPr>
-          <w:t xml:space="preserve">https://barn-to-bank.vercel.app</w:t>
+          <w:t xml:space="preserve">https://barntobank.com/app</w:t>
         </w:r>
       </w:hyperlink>
     </w:p>
     <w:p>
       <w:pPr>
+        <w:spacing w:after="240"/>
+      </w:pPr>
+      <w:r>
+        <w:t xml:space="preserve">Public site: </w:t>
+      </w:r>
+      <w:hyperlink w:history="1" r:id="rIddqzskii22ek0yyd01qjvw">
+        <w:r>
+          <w:rPr>
+            <w:rStyle w:val="Hyperlink"/>
+            <w:color w:val="0563C1"/>
+            <w:u w:val="single"/>
+          </w:rPr>
+          <w:t xml:space="preserve">https://barntobank.com</w:t>
+        </w:r>
+      </w:hyperlink>
+    </w:p>
+    <w:p>
+      <w:pPr>
         <w:pStyle w:val="Heading1"/>
       </w:pPr>
       <w:r>
-        <w:t xml:space="preserve">Quick Start (5 Minutes)</w:t>
+        <w:t xml:space="preserve">What This Platform Is</w:t>
+      </w:r>
+    </w:p>
+    <w:p>
+      <w:pPr>
+        <w:spacing w:after="120"/>
+      </w:pPr>
+      <w:r>
+        <w:t xml:space="preserve">Barn to Bank is two connected pieces: a public marketing site that captures land leads, and a password-protected origination app where your team enriches parcels, routes deals, reaches owners, and builds a compounding intel moat.</w:t>
+      </w:r>
+    </w:p>
+    <w:tbl>
+      <w:tblPr>
+        <w:tblW w:type="dxa" w:w="9360"/>
+        <w:tblBorders>
+          <w:top w:val="single" w:color="auto" w:sz="4"/>
+          <w:left w:val="single" w:color="auto" w:sz="4"/>
+          <w:bottom w:val="single" w:color="auto" w:sz="4"/>
+          <w:right w:val="single" w:color="auto" w:sz="4"/>
+          <w:insideH w:val="single" w:color="auto" w:sz="4"/>
+          <w:insideV w:val="single" w:color="auto" w:sz="4"/>
+        </w:tblBorders>
+      </w:tblPr>
+      <w:tblGrid>
+        <w:gridCol w:w="2200"/>
+        <w:gridCol w:w="3000"/>
+        <w:gridCol w:w="4160"/>
+      </w:tblGrid>
+      <w:tr>
+        <w:tc>
+          <w:tcPr>
+            <w:tcW w:type="dxa" w:w="2200"/>
+            <w:tcBorders>
+              <w:top w:val="single" w:color="CCCCCC" w:sz="1"/>
+              <w:left w:val="single" w:color="CCCCCC" w:sz="1"/>
+              <w:bottom w:val="single" w:color="CCCCCC" w:sz="1"/>
+              <w:right w:val="single" w:color="CCCCCC" w:sz="1"/>
+            </w:tcBorders>
+            <w:shd w:fill="E8E0D0" w:val="clear"/>
+            <w:tcMar>
+              <w:top w:type="dxa" w:w="80"/>
+              <w:left w:type="dxa" w:w="120"/>
+              <w:bottom w:type="dxa" w:w="80"/>
+              <w:right w:type="dxa" w:w="120"/>
+            </w:tcMar>
+          </w:tcPr>
+          <w:p>
+            <w:r>
+              <w:rPr>
+                <w:b/>
+                <w:bCs/>
+              </w:rPr>
+              <w:t xml:space="preserve">Piece</w:t>
+            </w:r>
+          </w:p>
+        </w:tc>
+        <w:tc>
+          <w:tcPr>
+            <w:tcW w:type="dxa" w:w="3000"/>
+            <w:tcBorders>
+              <w:top w:val="single" w:color="CCCCCC" w:sz="1"/>
+              <w:left w:val="single" w:color="CCCCCC" w:sz="1"/>
+              <w:bottom w:val="single" w:color="CCCCCC" w:sz="1"/>
+              <w:right w:val="single" w:color="CCCCCC" w:sz="1"/>
+            </w:tcBorders>
+            <w:shd w:fill="E8E0D0" w:val="clear"/>
+            <w:tcMar>
+              <w:top w:type="dxa" w:w="80"/>
+              <w:left w:type="dxa" w:w="120"/>
+              <w:bottom w:type="dxa" w:w="80"/>
+              <w:right w:type="dxa" w:w="120"/>
+            </w:tcMar>
+          </w:tcPr>
+          <w:p>
+            <w:r>
+              <w:rPr>
+                <w:b/>
+                <w:bCs/>
+              </w:rPr>
+              <w:t xml:space="preserve">URL</w:t>
+            </w:r>
+          </w:p>
+        </w:tc>
+        <w:tc>
+          <w:tcPr>
+            <w:tcW w:type="dxa" w:w="4160"/>
+            <w:tcBorders>
+              <w:top w:val="single" w:color="CCCCCC" w:sz="1"/>
+              <w:left w:val="single" w:color="CCCCCC" w:sz="1"/>
+              <w:bottom w:val="single" w:color="CCCCCC" w:sz="1"/>
+              <w:right w:val="single" w:color="CCCCCC" w:sz="1"/>
+            </w:tcBorders>
+            <w:shd w:fill="E8E0D0" w:val="clear"/>
+            <w:tcMar>
+              <w:top w:type="dxa" w:w="80"/>
+              <w:left w:type="dxa" w:w="120"/>
+              <w:bottom w:type="dxa" w:w="80"/>
+              <w:right w:type="dxa" w:w="120"/>
+            </w:tcMar>
+          </w:tcPr>
+          <w:p>
+            <w:r>
+              <w:rPr>
+                <w:b/>
+                <w:bCs/>
+              </w:rPr>
+              <w:t xml:space="preserve">Who uses it</w:t>
+            </w:r>
+          </w:p>
+        </w:tc>
+      </w:tr>
+      <w:tr>
+        <w:tc>
+          <w:tcPr>
+            <w:tcW w:type="dxa" w:w="2200"/>
+            <w:tcBorders>
+              <w:top w:val="single" w:color="CCCCCC" w:sz="1"/>
+              <w:left w:val="single" w:color="CCCCCC" w:sz="1"/>
+              <w:bottom w:val="single" w:color="CCCCCC" w:sz="1"/>
+              <w:right w:val="single" w:color="CCCCCC" w:sz="1"/>
+            </w:tcBorders>
+            <w:shd w:fill="FFFFFF" w:val="clear"/>
+            <w:tcMar>
+              <w:top w:type="dxa" w:w="80"/>
+              <w:left w:type="dxa" w:w="120"/>
+              <w:bottom w:type="dxa" w:w="80"/>
+              <w:right w:type="dxa" w:w="120"/>
+            </w:tcMar>
+          </w:tcPr>
+          <w:p>
+            <w:r>
+              <w:rPr>
+                <w:b w:val="false"/>
+                <w:bCs w:val="false"/>
+              </w:rPr>
+              <w:t xml:space="preserve">Public marketing site</w:t>
+            </w:r>
+          </w:p>
+        </w:tc>
+        <w:tc>
+          <w:tcPr>
+            <w:tcW w:type="dxa" w:w="3000"/>
+            <w:tcBorders>
+              <w:top w:val="single" w:color="CCCCCC" w:sz="1"/>
+              <w:left w:val="single" w:color="CCCCCC" w:sz="1"/>
+              <w:bottom w:val="single" w:color="CCCCCC" w:sz="1"/>
+              <w:right w:val="single" w:color="CCCCCC" w:sz="1"/>
+            </w:tcBorders>
+            <w:shd w:fill="FFFFFF" w:val="clear"/>
+            <w:tcMar>
+              <w:top w:type="dxa" w:w="80"/>
+              <w:left w:type="dxa" w:w="120"/>
+              <w:bottom w:type="dxa" w:w="80"/>
+              <w:right w:type="dxa" w:w="120"/>
+            </w:tcMar>
+          </w:tcPr>
+          <w:p>
+            <w:r>
+              <w:rPr>
+                <w:b w:val="false"/>
+                <w:bCs w:val="false"/>
+              </w:rPr>
+              <w:t xml:space="preserve">https://barntobank.com</w:t>
+            </w:r>
+          </w:p>
+        </w:tc>
+        <w:tc>
+          <w:tcPr>
+            <w:tcW w:type="dxa" w:w="4160"/>
+            <w:tcBorders>
+              <w:top w:val="single" w:color="CCCCCC" w:sz="1"/>
+              <w:left w:val="single" w:color="CCCCCC" w:sz="1"/>
+              <w:bottom w:val="single" w:color="CCCCCC" w:sz="1"/>
+              <w:right w:val="single" w:color="CCCCCC" w:sz="1"/>
+            </w:tcBorders>
+            <w:shd w:fill="FFFFFF" w:val="clear"/>
+            <w:tcMar>
+              <w:top w:type="dxa" w:w="80"/>
+              <w:left w:type="dxa" w:w="120"/>
+              <w:bottom w:type="dxa" w:w="80"/>
+              <w:right w:type="dxa" w:w="120"/>
+            </w:tcMar>
+          </w:tcPr>
+          <w:p>
+            <w:r>
+              <w:rPr>
+                <w:b w:val="false"/>
+                <w:bCs w:val="false"/>
+              </w:rPr>
+              <w:t xml:space="preserve">Landowners, brokers, visitors</w:t>
+            </w:r>
+          </w:p>
+        </w:tc>
+      </w:tr>
+      <w:tr>
+        <w:tc>
+          <w:tcPr>
+            <w:tcW w:type="dxa" w:w="2200"/>
+            <w:tcBorders>
+              <w:top w:val="single" w:color="CCCCCC" w:sz="1"/>
+              <w:left w:val="single" w:color="CCCCCC" w:sz="1"/>
+              <w:bottom w:val="single" w:color="CCCCCC" w:sz="1"/>
+              <w:right w:val="single" w:color="CCCCCC" w:sz="1"/>
+            </w:tcBorders>
+            <w:shd w:fill="FFFFFF" w:val="clear"/>
+            <w:tcMar>
+              <w:top w:type="dxa" w:w="80"/>
+              <w:left w:type="dxa" w:w="120"/>
+              <w:bottom w:type="dxa" w:w="80"/>
+              <w:right w:type="dxa" w:w="120"/>
+            </w:tcMar>
+          </w:tcPr>
+          <w:p>
+            <w:r>
+              <w:rPr>
+                <w:b w:val="false"/>
+                <w:bCs w:val="false"/>
+              </w:rPr>
+              <w:t xml:space="preserve">Staff origination app</w:t>
+            </w:r>
+          </w:p>
+        </w:tc>
+        <w:tc>
+          <w:tcPr>
+            <w:tcW w:type="dxa" w:w="3000"/>
+            <w:tcBorders>
+              <w:top w:val="single" w:color="CCCCCC" w:sz="1"/>
+              <w:left w:val="single" w:color="CCCCCC" w:sz="1"/>
+              <w:bottom w:val="single" w:color="CCCCCC" w:sz="1"/>
+              <w:right w:val="single" w:color="CCCCCC" w:sz="1"/>
+            </w:tcBorders>
+            <w:shd w:fill="FFFFFF" w:val="clear"/>
+            <w:tcMar>
+              <w:top w:type="dxa" w:w="80"/>
+              <w:left w:type="dxa" w:w="120"/>
+              <w:bottom w:type="dxa" w:w="80"/>
+              <w:right w:type="dxa" w:w="120"/>
+            </w:tcMar>
+          </w:tcPr>
+          <w:p>
+            <w:r>
+              <w:rPr>
+                <w:b w:val="false"/>
+                <w:bCs w:val="false"/>
+              </w:rPr>
+              <w:t xml:space="preserve">https://barntobank.com/app</w:t>
+            </w:r>
+          </w:p>
+        </w:tc>
+        <w:tc>
+          <w:tcPr>
+            <w:tcW w:type="dxa" w:w="4160"/>
+            <w:tcBorders>
+              <w:top w:val="single" w:color="CCCCCC" w:sz="1"/>
+              <w:left w:val="single" w:color="CCCCCC" w:sz="1"/>
+              <w:bottom w:val="single" w:color="CCCCCC" w:sz="1"/>
+              <w:right w:val="single" w:color="CCCCCC" w:sz="1"/>
+            </w:tcBorders>
+            <w:shd w:fill="FFFFFF" w:val="clear"/>
+            <w:tcMar>
+              <w:top w:type="dxa" w:w="80"/>
+              <w:left w:type="dxa" w:w="120"/>
+              <w:bottom w:type="dxa" w:w="80"/>
+              <w:right w:type="dxa" w:w="120"/>
+            </w:tcMar>
+          </w:tcPr>
+          <w:p>
+            <w:r>
+              <w:rPr>
+                <w:b w:val="false"/>
+                <w:bCs w:val="false"/>
+              </w:rPr>
+              <w:t xml:space="preserve">Jack, analysts, origination team</w:t>
+            </w:r>
+          </w:p>
+        </w:tc>
+      </w:tr>
+      <w:tr>
+        <w:tc>
+          <w:tcPr>
+            <w:tcW w:type="dxa" w:w="2200"/>
+            <w:tcBorders>
+              <w:top w:val="single" w:color="CCCCCC" w:sz="1"/>
+              <w:left w:val="single" w:color="CCCCCC" w:sz="1"/>
+              <w:bottom w:val="single" w:color="CCCCCC" w:sz="1"/>
+              <w:right w:val="single" w:color="CCCCCC" w:sz="1"/>
+            </w:tcBorders>
+            <w:shd w:fill="FFFFFF" w:val="clear"/>
+            <w:tcMar>
+              <w:top w:type="dxa" w:w="80"/>
+              <w:left w:type="dxa" w:w="120"/>
+              <w:bottom w:type="dxa" w:w="80"/>
+              <w:right w:type="dxa" w:w="120"/>
+            </w:tcMar>
+          </w:tcPr>
+          <w:p>
+            <w:r>
+              <w:rPr>
+                <w:b w:val="false"/>
+                <w:bCs w:val="false"/>
+              </w:rPr>
+              <w:t xml:space="preserve">Staff login</w:t>
+            </w:r>
+          </w:p>
+        </w:tc>
+        <w:tc>
+          <w:tcPr>
+            <w:tcW w:type="dxa" w:w="3000"/>
+            <w:tcBorders>
+              <w:top w:val="single" w:color="CCCCCC" w:sz="1"/>
+              <w:left w:val="single" w:color="CCCCCC" w:sz="1"/>
+              <w:bottom w:val="single" w:color="CCCCCC" w:sz="1"/>
+              <w:right w:val="single" w:color="CCCCCC" w:sz="1"/>
+            </w:tcBorders>
+            <w:shd w:fill="FFFFFF" w:val="clear"/>
+            <w:tcMar>
+              <w:top w:type="dxa" w:w="80"/>
+              <w:left w:type="dxa" w:w="120"/>
+              <w:bottom w:type="dxa" w:w="80"/>
+              <w:right w:type="dxa" w:w="120"/>
+            </w:tcMar>
+          </w:tcPr>
+          <w:p>
+            <w:r>
+              <w:rPr>
+                <w:b w:val="false"/>
+                <w:bCs w:val="false"/>
+              </w:rPr>
+              <w:t xml:space="preserve">https://barntobank.com/app/login</w:t>
+            </w:r>
+          </w:p>
+        </w:tc>
+        <w:tc>
+          <w:tcPr>
+            <w:tcW w:type="dxa" w:w="4160"/>
+            <w:tcBorders>
+              <w:top w:val="single" w:color="CCCCCC" w:sz="1"/>
+              <w:left w:val="single" w:color="CCCCCC" w:sz="1"/>
+              <w:bottom w:val="single" w:color="CCCCCC" w:sz="1"/>
+              <w:right w:val="single" w:color="CCCCCC" w:sz="1"/>
+            </w:tcBorders>
+            <w:shd w:fill="FFFFFF" w:val="clear"/>
+            <w:tcMar>
+              <w:top w:type="dxa" w:w="80"/>
+              <w:left w:type="dxa" w:w="120"/>
+              <w:bottom w:type="dxa" w:w="80"/>
+              <w:right w:type="dxa" w:w="120"/>
+            </w:tcMar>
+          </w:tcPr>
+          <w:p>
+            <w:r>
+              <w:rPr>
+                <w:b w:val="false"/>
+                <w:bCs w:val="false"/>
+              </w:rPr>
+              <w:t xml:space="preserve">Anyone with the origination password</w:t>
+            </w:r>
+          </w:p>
+        </w:tc>
+      </w:tr>
+    </w:tbl>
+    <w:p>
+      <w:pPr>
+        <w:pStyle w:val="Heading1"/>
+      </w:pPr>
+      <w:r>
+        <w:t xml:space="preserve">Quick Start — First 10 Minutes</w:t>
       </w:r>
     </w:p>
     <w:p>
@@ -66,7 +450,7 @@
         <w:spacing w:after="80"/>
       </w:pPr>
       <w:r>
-        <w:t xml:space="preserve">Open the app link in Chrome or Safari (desktop or phone).</w:t>
+        <w:t xml:space="preserve">Go to https://barntobank.com/app and sign in with the origination password.</w:t>
       </w:r>
     </w:p>
     <w:p>
@@ -79,7 +463,7 @@
         <w:spacing w:after="80"/>
       </w:pPr>
       <w:r>
-        <w:t xml:space="preserve">Read the welcome card, then dismiss it.</w:t>
+        <w:t xml:space="preserve">Dismiss the welcome card on the left (or read it — it explains the four-step workflow).</w:t>
       </w:r>
     </w:p>
     <w:p>
@@ -92,7 +476,7 @@
         <w:spacing w:after="80"/>
       </w:pPr>
       <w:r>
-        <w:t xml:space="preserve">In Intake, pick a county and enter an address or parcel number.</w:t>
+        <w:t xml:space="preserve">In Intake, choose a county and enter a property address or parcel/APN.</w:t>
       </w:r>
     </w:p>
     <w:p>
@@ -105,7 +489,7 @@
         <w:spacing w:after="80"/>
       </w:pPr>
       <w:r>
-        <w:t xml:space="preserve">Optional: sign in to id.land for full parcel and comp data.</w:t>
+        <w:t xml:space="preserve">Click Run Automation 1. Wait for jurisdiction, flood, utilities, comps, and owner contact to populate.</w:t>
       </w:r>
     </w:p>
     <w:p>
@@ -118,7 +502,7 @@
         <w:spacing w:after="80"/>
       </w:pPr>
       <w:r>
-        <w:t xml:space="preserve">Click Run Automation 1 → review → Add to Pipeline.</w:t>
+        <w:t xml:space="preserve">Click + Add to Pipeline.</w:t>
       </w:r>
     </w:p>
     <w:p>
@@ -131,7 +515,33 @@
         <w:spacing w:after="80"/>
       </w:pPr>
       <w:r>
-        <w:t xml:space="preserve">Open Intel → Cloud Sync to merge with your team.</w:t>
+        <w:t xml:space="preserve">Open the Deals tab, click the new deal, review entitlement score and route (Develop / Sell / Retail).</w:t>
+      </w:r>
+    </w:p>
+    <w:p>
+      <w:pPr>
+        <w:pStyle w:val="ListParagraph"/>
+        <w:numPr>
+          <w:ilvl w:val="0"/>
+          <w:numId w:val="2"/>
+        </w:numPr>
+        <w:spacing w:after="80"/>
+      </w:pPr>
+      <w:r>
+        <w:t xml:space="preserve">Go to Outreach → Build Mail List → print labels or export CSV (no DNC vendor needed).</w:t>
+      </w:r>
+    </w:p>
+    <w:p>
+      <w:pPr>
+        <w:pStyle w:val="ListParagraph"/>
+        <w:numPr>
+          <w:ilvl w:val="0"/>
+          <w:numId w:val="2"/>
+        </w:numPr>
+        <w:spacing w:after="80"/>
+      </w:pPr>
+      <w:r>
+        <w:t xml:space="preserve">Go to Intel → Cloud Sync to share pipeline with your team.</w:t>
       </w:r>
     </w:p>
     <w:p>
@@ -139,6 +549,79 @@
         <w:pStyle w:val="Heading1"/>
       </w:pPr>
       <w:r>
+        <w:t xml:space="preserve">Signing In &amp; Security</w:t>
+      </w:r>
+    </w:p>
+    <w:p>
+      <w:pPr>
+        <w:pStyle w:val="ListParagraph"/>
+        <w:numPr>
+          <w:ilvl w:val="0"/>
+          <w:numId w:val="3"/>
+        </w:numPr>
+        <w:spacing w:after="80"/>
+      </w:pPr>
+      <w:r>
+        <w:t xml:space="preserve">Staff app and APIs are protected. Bookmark https://barntobank.com/app/login if prompted.</w:t>
+      </w:r>
+    </w:p>
+    <w:p>
+      <w:pPr>
+        <w:pStyle w:val="ListParagraph"/>
+        <w:numPr>
+          <w:ilvl w:val="0"/>
+          <w:numId w:val="3"/>
+        </w:numPr>
+        <w:spacing w:after="80"/>
+      </w:pPr>
+      <w:r>
+        <w:t xml:space="preserve">Password is set in Vercel as ORIGINATION_PASSWORD — ask your admin if you do not have it.</w:t>
+      </w:r>
+    </w:p>
+    <w:p>
+      <w:pPr>
+        <w:pStyle w:val="ListParagraph"/>
+        <w:numPr>
+          <w:ilvl w:val="0"/>
+          <w:numId w:val="3"/>
+        </w:numPr>
+        <w:spacing w:after="80"/>
+      </w:pPr>
+      <w:r>
+        <w:t xml:space="preserve">Sign Out is in the header (desktop). Session lasts 30 days in your browser.</w:t>
+      </w:r>
+    </w:p>
+    <w:p>
+      <w:pPr>
+        <w:pStyle w:val="ListParagraph"/>
+        <w:numPr>
+          <w:ilvl w:val="0"/>
+          <w:numId w:val="3"/>
+        </w:numPr>
+        <w:spacing w:after="80"/>
+      </w:pPr>
+      <w:r>
+        <w:t xml:space="preserve">Public site contact form posts to /api/leads without a password — those leads appear in Website Leads inside the app.</w:t>
+      </w:r>
+    </w:p>
+    <w:p>
+      <w:pPr>
+        <w:pStyle w:val="ListParagraph"/>
+        <w:numPr>
+          <w:ilvl w:val="0"/>
+          <w:numId w:val="3"/>
+        </w:numPr>
+        <w:spacing w:after="80"/>
+      </w:pPr>
+      <w:r>
+        <w:t xml:space="preserve">Theme toggle (sun/moon) in the header switches light and dark mode; preference is saved in your browser.</w:t>
+      </w:r>
+    </w:p>
+    <w:p>
+      <w:pPr>
+        <w:pStyle w:val="Heading1"/>
+      </w:pPr>
+      <w:r>
         <w:t xml:space="preserve">Navigation</w:t>
       </w:r>
     </w:p>
@@ -147,7 +630,15 @@
         <w:spacing w:after="120"/>
       </w:pPr>
       <w:r>
-        <w:t xml:space="preserve">Use the section bar under the header: Intake | Deals | Silos | Outreach | Intel.</w:t>
+        <w:t xml:space="preserve">Desktop: use the sticky section bar — Intake | Deals | Silos | Outreach | Intel.</w:t>
+      </w:r>
+    </w:p>
+    <w:p>
+      <w:pPr>
+        <w:spacing w:after="120"/>
+      </w:pPr>
+      <w:r>
+        <w:t xml:space="preserve">Mobile: same section bar at the bottom of the header area; ← Site returns to the public marketing site; ← Main Site in the header does the same.</w:t>
       </w:r>
     </w:p>
     <w:tbl>
@@ -273,7 +764,7 @@
                 <w:b w:val="false"/>
                 <w:bCs w:val="false"/>
               </w:rPr>
-              <w:t xml:space="preserve">Enter address/APN, run Automation 1 enrichment</w:t>
+              <w:t xml:space="preserve">Enter address/APN, run Automation 1, connect id.land, view website leads</w:t>
             </w:r>
           </w:p>
         </w:tc>
@@ -329,7 +820,7 @@
                 <w:b w:val="false"/>
                 <w:bCs w:val="false"/>
               </w:rPr>
-              <w:t xml:space="preserve">View pipeline table or cards, open deal details</w:t>
+              <w:t xml:space="preserve">Pipeline table or cards, open deal modal, quick add</w:t>
             </w:r>
           </w:p>
         </w:tc>
@@ -385,7 +876,7 @@
                 <w:b w:val="false"/>
                 <w:bCs w:val="false"/>
               </w:rPr>
-              <w:t xml:space="preserve">See deals grouped by Develop, Sell, Retail</w:t>
+              <w:t xml:space="preserve">Deals grouped by Develop, Sell (Flip), Retail</w:t>
             </w:r>
           </w:p>
         </w:tc>
@@ -441,7 +932,7 @@
                 <w:b w:val="false"/>
                 <w:bCs w:val="false"/>
               </w:rPr>
-              <w:t xml:space="preserve">Build outreach list, DNC scrub, text/mail queues</w:t>
+              <w:t xml:space="preserve">Direct mail (default) or cold texts (DNC vendor required)</w:t>
             </w:r>
           </w:p>
         </w:tc>
@@ -497,7 +988,7 @@
                 <w:b w:val="false"/>
                 <w:bCs w:val="false"/>
               </w:rPr>
-              <w:t xml:space="preserve">Comp lake, plat alerts, audit log, Cloud Sync</w:t>
+              <w:t xml:space="preserve">Comp lake, plat alerts, audit log, cloud sync, website leads refresh</w:t>
             </w:r>
           </w:p>
         </w:tc>
@@ -508,7 +999,7 @@
         <w:spacing w:after="120"/>
       </w:pPr>
       <w:r>
-        <w:t xml:space="preserve">Header shortcuts: Intel jumps to Moat Intelligence. Cloud Sync runs team sync immediately.</w:t>
+        <w:t xml:space="preserve">Header buttons: Copy App Link (share with team), Feature Request, Intel (jump to moat), Cloud Sync (immediate team sync), Theme, Sign Out.</w:t>
       </w:r>
     </w:p>
     <w:p>
@@ -516,7 +1007,75 @@
         <w:pStyle w:val="Heading1"/>
       </w:pPr>
       <w:r>
-        <w:t xml:space="preserve">1. Intake — Run Automation 1</w:t>
+        <w:t xml:space="preserve">1. Intake — From Lead to Enriched Deal</w:t>
+      </w:r>
+    </w:p>
+    <w:p>
+      <w:pPr>
+        <w:pStyle w:val="Heading2"/>
+      </w:pPr>
+      <w:r>
+        <w:t xml:space="preserve">Website Leads (inbound)</w:t>
+      </w:r>
+    </w:p>
+    <w:p>
+      <w:pPr>
+        <w:pStyle w:val="ListParagraph"/>
+        <w:numPr>
+          <w:ilvl w:val="0"/>
+          <w:numId w:val="3"/>
+        </w:numPr>
+        <w:spacing w:after="80"/>
+      </w:pPr>
+      <w:r>
+        <w:t xml:space="preserve">Leads from the public site contact form land in Website Leads on the Intake panel.</w:t>
+      </w:r>
+    </w:p>
+    <w:p>
+      <w:pPr>
+        <w:pStyle w:val="ListParagraph"/>
+        <w:numPr>
+          <w:ilvl w:val="0"/>
+          <w:numId w:val="3"/>
+        </w:numPr>
+        <w:spacing w:after="80"/>
+      </w:pPr>
+      <w:r>
+        <w:t xml:space="preserve">Click Refresh to pull latest from Supabase.</w:t>
+      </w:r>
+    </w:p>
+    <w:p>
+      <w:pPr>
+        <w:pStyle w:val="ListParagraph"/>
+        <w:numPr>
+          <w:ilvl w:val="0"/>
+          <w:numId w:val="3"/>
+        </w:numPr>
+        <w:spacing w:after="80"/>
+      </w:pPr>
+      <w:r>
+        <w:t xml:space="preserve">Statuses: new → contacted → converted or dismissed.</w:t>
+      </w:r>
+    </w:p>
+    <w:p>
+      <w:pPr>
+        <w:pStyle w:val="ListParagraph"/>
+        <w:numPr>
+          <w:ilvl w:val="0"/>
+          <w:numId w:val="3"/>
+        </w:numPr>
+        <w:spacing w:after="80"/>
+      </w:pPr>
+      <w:r>
+        <w:t xml:space="preserve">Inbound leads do not need DNC scrub — they contacted you first.</w:t>
+      </w:r>
+    </w:p>
+    <w:p>
+      <w:pPr>
+        <w:pStyle w:val="Heading2"/>
+      </w:pPr>
+      <w:r>
+        <w:t xml:space="preserve">Automation 1 (parcel enrichment)</w:t>
       </w:r>
     </w:p>
     <w:p>
@@ -550,7 +1109,7 @@
         <w:spacing w:after="80"/>
       </w:pPr>
       <w:r>
-        <w:t xml:space="preserve">Enter the full address (e.g. 6200 Old Pearsall Rd, San Antonio TX) or parcel ID.</w:t>
+        <w:t xml:space="preserve">Enter the full address or parcel ID.</w:t>
       </w:r>
     </w:p>
     <w:p>
@@ -563,7 +1122,7 @@
         <w:spacing w:after="80"/>
       </w:pPr>
       <w:r>
-        <w:t xml:space="preserve">Choose the county from the dropdown.</w:t>
+        <w:t xml:space="preserve">Choose county from the dropdown.</w:t>
       </w:r>
     </w:p>
     <w:p>
@@ -576,7 +1135,7 @@
         <w:spacing w:after="80"/>
       </w:pPr>
       <w:r>
-        <w:t xml:space="preserve">Click Run Automation 1 and wait for the pipeline steps to complete.</w:t>
+        <w:t xml:space="preserve">Click Run Automation 1. Watch the pipeline steps complete.</w:t>
       </w:r>
     </w:p>
     <w:p>
@@ -589,7 +1148,7 @@
         <w:spacing w:after="80"/>
       </w:pPr>
       <w:r>
-        <w:t xml:space="preserve">Review the enrichment panel — toggle Internal vs Client view.</w:t>
+        <w:t xml:space="preserve">Review enrichment — toggle Internal vs Client view (client view redacts skip-trace phones).</w:t>
       </w:r>
     </w:p>
     <w:p>
@@ -602,7 +1161,7 @@
         <w:spacing w:after="80"/>
       </w:pPr>
       <w:r>
-        <w:t xml:space="preserve">Click + Add to Pipeline when ready.</w:t>
+        <w:t xml:space="preserve">Click + Add to Pipeline.</w:t>
       </w:r>
     </w:p>
     <w:p>
@@ -623,72 +1182,85 @@
         <w:spacing w:after="80"/>
       </w:pPr>
       <w:r>
-        <w:t xml:space="preserve">Jurisdiction: city limits, ETJ, or county-only</w:t>
-      </w:r>
-    </w:p>
-    <w:p>
-      <w:pPr>
-        <w:pStyle w:val="ListParagraph"/>
-        <w:numPr>
-          <w:ilvl w:val="0"/>
-          <w:numId w:val="3"/>
-        </w:numPr>
-        <w:spacing w:after="80"/>
-      </w:pPr>
-      <w:r>
-        <w:t xml:space="preserve">FEMA flood zone and SFHA flag</w:t>
-      </w:r>
-    </w:p>
-    <w:p>
-      <w:pPr>
-        <w:pStyle w:val="ListParagraph"/>
-        <w:numPr>
-          <w:ilvl w:val="0"/>
-          <w:numId w:val="3"/>
-        </w:numPr>
-        <w:spacing w:after="80"/>
-      </w:pPr>
-      <w:r>
-        <w:t xml:space="preserve">PUC water and sewer CCN holders</w:t>
-      </w:r>
-    </w:p>
-    <w:p>
-      <w:pPr>
-        <w:pStyle w:val="ListParagraph"/>
-        <w:numPr>
-          <w:ilvl w:val="0"/>
-          <w:numId w:val="3"/>
-        </w:numPr>
-        <w:spacing w:after="80"/>
-      </w:pPr>
-      <w:r>
-        <w:t xml:space="preserve">Private comps for the county (Comp Lake + seed data)</w:t>
-      </w:r>
-    </w:p>
-    <w:p>
-      <w:pPr>
-        <w:pStyle w:val="ListParagraph"/>
-        <w:numPr>
-          <w:ilvl w:val="0"/>
-          <w:numId w:val="3"/>
-        </w:numPr>
-        <w:spacing w:after="80"/>
-      </w:pPr>
-      <w:r>
-        <w:t xml:space="preserve">Nearby for-sale SF communities (Waterloo BTR excluded from radius)</w:t>
-      </w:r>
-    </w:p>
-    <w:p>
-      <w:pPr>
-        <w:pStyle w:val="ListParagraph"/>
-        <w:numPr>
-          <w:ilvl w:val="0"/>
-          <w:numId w:val="3"/>
-        </w:numPr>
-        <w:spacing w:after="80"/>
-      </w:pPr>
-      <w:r>
-        <w:t xml:space="preserve">Owner contact (Forewarn — license-gated mock until API key is set)</w:t>
+        <w:t xml:space="preserve">Jurisdiction: city limits, ETJ, or unincorporated county</w:t>
+      </w:r>
+    </w:p>
+    <w:p>
+      <w:pPr>
+        <w:pStyle w:val="ListParagraph"/>
+        <w:numPr>
+          <w:ilvl w:val="0"/>
+          <w:numId w:val="3"/>
+        </w:numPr>
+        <w:spacing w:after="80"/>
+      </w:pPr>
+      <w:r>
+        <w:t xml:space="preserve">FEMA flood zone and SFHA (Special Flood Hazard Area) flag</w:t>
+      </w:r>
+    </w:p>
+    <w:p>
+      <w:pPr>
+        <w:pStyle w:val="ListParagraph"/>
+        <w:numPr>
+          <w:ilvl w:val="0"/>
+          <w:numId w:val="3"/>
+        </w:numPr>
+        <w:spacing w:after="80"/>
+      </w:pPr>
+      <w:r>
+        <w:t xml:space="preserve">PUC water and sewer CCN (utility service areas)</w:t>
+      </w:r>
+    </w:p>
+    <w:p>
+      <w:pPr>
+        <w:pStyle w:val="ListParagraph"/>
+        <w:numPr>
+          <w:ilvl w:val="0"/>
+          <w:numId w:val="3"/>
+        </w:numPr>
+        <w:spacing w:after="80"/>
+      </w:pPr>
+      <w:r>
+        <w:t xml:space="preserve">Private comps from Comp Lake + county seed data</w:t>
+      </w:r>
+    </w:p>
+    <w:p>
+      <w:pPr>
+        <w:pStyle w:val="ListParagraph"/>
+        <w:numPr>
+          <w:ilvl w:val="0"/>
+          <w:numId w:val="3"/>
+        </w:numPr>
+        <w:spacing w:after="80"/>
+      </w:pPr>
+      <w:r>
+        <w:t xml:space="preserve">Nearby for-sale SF communities within radius</w:t>
+      </w:r>
+    </w:p>
+    <w:p>
+      <w:pPr>
+        <w:pStyle w:val="ListParagraph"/>
+        <w:numPr>
+          <w:ilvl w:val="0"/>
+          <w:numId w:val="3"/>
+        </w:numPr>
+        <w:spacing w:after="80"/>
+      </w:pPr>
+      <w:r>
+        <w:t xml:space="preserve">Owner contact via Forewarn (mock until production API key is configured)</w:t>
+      </w:r>
+    </w:p>
+    <w:p>
+      <w:pPr>
+        <w:pStyle w:val="ListParagraph"/>
+        <w:numPr>
+          <w:ilvl w:val="0"/>
+          <w:numId w:val="3"/>
+        </w:numPr>
+        <w:spacing w:after="80"/>
+      </w:pPr>
+      <w:r>
+        <w:t xml:space="preserve">Entitlement score 0–100 and Develop / Sell / Retail recommendation</w:t>
       </w:r>
     </w:p>
     <w:p>
@@ -696,46 +1268,46 @@
         <w:pStyle w:val="Heading3"/>
       </w:pPr>
       <w:r>
-        <w:t xml:space="preserve">id.land connection</w:t>
-      </w:r>
-    </w:p>
-    <w:p>
-      <w:pPr>
-        <w:pStyle w:val="ListParagraph"/>
-        <w:numPr>
-          <w:ilvl w:val="0"/>
-          <w:numId w:val="3"/>
-        </w:numPr>
-        <w:spacing w:after="80"/>
-      </w:pPr>
-      <w:r>
-        <w:t xml:space="preserve">Enter your id.land email and password, or paste a Bearer token under Advanced.</w:t>
-      </w:r>
-    </w:p>
-    <w:p>
-      <w:pPr>
-        <w:pStyle w:val="ListParagraph"/>
-        <w:numPr>
-          <w:ilvl w:val="0"/>
-          <w:numId w:val="3"/>
-        </w:numPr>
-        <w:spacing w:after="80"/>
-      </w:pPr>
-      <w:r>
-        <w:t xml:space="preserve">Token stays in your browser only — not committed to the app file.</w:t>
-      </w:r>
-    </w:p>
-    <w:p>
-      <w:pPr>
-        <w:pStyle w:val="ListParagraph"/>
-        <w:numPr>
-          <w:ilvl w:val="0"/>
-          <w:numId w:val="3"/>
-        </w:numPr>
-        <w:spacing w:after="80"/>
-      </w:pPr>
-      <w:r>
-        <w:t xml:space="preserve">With a valid token, parcel and comp fields upgrade from MOCK to LIVE.</w:t>
+        <w:t xml:space="preserve">id.land connection (optional, recommended)</w:t>
+      </w:r>
+    </w:p>
+    <w:p>
+      <w:pPr>
+        <w:pStyle w:val="ListParagraph"/>
+        <w:numPr>
+          <w:ilvl w:val="0"/>
+          <w:numId w:val="3"/>
+        </w:numPr>
+        <w:spacing w:after="80"/>
+      </w:pPr>
+      <w:r>
+        <w:t xml:space="preserve">Enter id.land email/password or paste a Bearer token under Advanced.</w:t>
+      </w:r>
+    </w:p>
+    <w:p>
+      <w:pPr>
+        <w:pStyle w:val="ListParagraph"/>
+        <w:numPr>
+          <w:ilvl w:val="0"/>
+          <w:numId w:val="3"/>
+        </w:numPr>
+        <w:spacing w:after="80"/>
+      </w:pPr>
+      <w:r>
+        <w:t xml:space="preserve">Token stays in your browser only — never stored in the repo.</w:t>
+      </w:r>
+    </w:p>
+    <w:p>
+      <w:pPr>
+        <w:pStyle w:val="ListParagraph"/>
+        <w:numPr>
+          <w:ilvl w:val="0"/>
+          <w:numId w:val="3"/>
+        </w:numPr>
+        <w:spacing w:after="80"/>
+      </w:pPr>
+      <w:r>
+        <w:t xml:space="preserve">Live token upgrades parcel geometry, land use, and market comps from MOCK to LIVE.</w:t>
       </w:r>
     </w:p>
     <w:p>
@@ -751,33 +1323,33 @@
         <w:pStyle w:val="Heading3"/>
       </w:pPr>
       <w:r>
-        <w:t xml:space="preserve">Viewing deals</w:t>
-      </w:r>
-    </w:p>
-    <w:p>
-      <w:pPr>
-        <w:pStyle w:val="ListParagraph"/>
-        <w:numPr>
-          <w:ilvl w:val="0"/>
-          <w:numId w:val="3"/>
-        </w:numPr>
-        <w:spacing w:after="80"/>
-      </w:pPr>
-      <w:r>
-        <w:t xml:space="preserve">Table view: sortable list with status, route, entitlement score pill.</w:t>
-      </w:r>
-    </w:p>
-    <w:p>
-      <w:pPr>
-        <w:pStyle w:val="ListParagraph"/>
-        <w:numPr>
-          <w:ilvl w:val="0"/>
-          <w:numId w:val="3"/>
-        </w:numPr>
-        <w:spacing w:after="80"/>
-      </w:pPr>
-      <w:r>
-        <w:t xml:space="preserve">Cards view: mobile-friendly cards with comp band summary.</w:t>
+        <w:t xml:space="preserve">Views</w:t>
+      </w:r>
+    </w:p>
+    <w:p>
+      <w:pPr>
+        <w:pStyle w:val="ListParagraph"/>
+        <w:numPr>
+          <w:ilvl w:val="0"/>
+          <w:numId w:val="3"/>
+        </w:numPr>
+        <w:spacing w:after="80"/>
+      </w:pPr>
+      <w:r>
+        <w:t xml:space="preserve">Table view: sortable columns, status, route badge, entitlement pill.</w:t>
+      </w:r>
+    </w:p>
+    <w:p>
+      <w:pPr>
+        <w:pStyle w:val="ListParagraph"/>
+        <w:numPr>
+          <w:ilvl w:val="0"/>
+          <w:numId w:val="3"/>
+        </w:numPr>
+        <w:spacing w:after="80"/>
+      </w:pPr>
+      <w:r>
+        <w:t xml:space="preserve">Cards view: better on phone — acreage, comp band, bottleneck flag.</w:t>
       </w:r>
     </w:p>
     <w:p>
@@ -811,20 +1383,20 @@
         <w:spacing w:after="80"/>
       </w:pPr>
       <w:r>
-        <w:t xml:space="preserve">+ From Intake: scroll to intake after running Automation 1.</w:t>
-      </w:r>
-    </w:p>
-    <w:p>
-      <w:pPr>
-        <w:pStyle w:val="ListParagraph"/>
-        <w:numPr>
-          <w:ilvl w:val="0"/>
-          <w:numId w:val="3"/>
-        </w:numPr>
-        <w:spacing w:after="80"/>
-      </w:pPr>
-      <w:r>
-        <w:t xml:space="preserve">+ Quick Add: manual entry without enrichment (run Automation 1 later).</w:t>
+        <w:t xml:space="preserve">From Intake: after Automation 1, click + Add to Pipeline.</w:t>
+      </w:r>
+    </w:p>
+    <w:p>
+      <w:pPr>
+        <w:pStyle w:val="ListParagraph"/>
+        <w:numPr>
+          <w:ilvl w:val="0"/>
+          <w:numId w:val="3"/>
+        </w:numPr>
+        <w:spacing w:after="80"/>
+      </w:pPr>
+      <w:r>
+        <w:t xml:space="preserve">Quick Add: manual entry without enrichment — run Automation 1 later from the deal modal.</w:t>
       </w:r>
     </w:p>
     <w:p>
@@ -832,33 +1404,33 @@
         <w:pStyle w:val="Heading3"/>
       </w:pPr>
       <w:r>
-        <w:t xml:space="preserve">Deal modal sections</w:t>
-      </w:r>
-    </w:p>
-    <w:p>
-      <w:pPr>
-        <w:pStyle w:val="ListParagraph"/>
-        <w:numPr>
-          <w:ilvl w:val="0"/>
-          <w:numId w:val="3"/>
-        </w:numPr>
-        <w:spacing w:after="80"/>
-      </w:pPr>
-      <w:r>
-        <w:t xml:space="preserve">Entitlement Score: 0–100 with Develop / Sell / Retail recommendation</w:t>
-      </w:r>
-    </w:p>
-    <w:p>
-      <w:pPr>
-        <w:pStyle w:val="ListParagraph"/>
-        <w:numPr>
-          <w:ilvl w:val="0"/>
-          <w:numId w:val="3"/>
-        </w:numPr>
-        <w:spacing w:after="80"/>
-      </w:pPr>
-      <w:r>
-        <w:t xml:space="preserve">Enriched property data, tax history, utilities</w:t>
+        <w:t xml:space="preserve">Deal modal — key sections</w:t>
+      </w:r>
+    </w:p>
+    <w:p>
+      <w:pPr>
+        <w:pStyle w:val="ListParagraph"/>
+        <w:numPr>
+          <w:ilvl w:val="0"/>
+          <w:numId w:val="3"/>
+        </w:numPr>
+        <w:spacing w:after="80"/>
+      </w:pPr>
+      <w:r>
+        <w:t xml:space="preserve">Entitlement Score and route recommendation</w:t>
+      </w:r>
+    </w:p>
+    <w:p>
+      <w:pPr>
+        <w:pStyle w:val="ListParagraph"/>
+        <w:numPr>
+          <w:ilvl w:val="0"/>
+          <w:numId w:val="3"/>
+        </w:numPr>
+        <w:spacing w:after="80"/>
+      </w:pPr>
+      <w:r>
+        <w:t xml:space="preserve">Enriched property, tax history, utilities, flood</w:t>
       </w:r>
     </w:p>
     <w:p>
@@ -884,33 +1456,46 @@
         <w:spacing w:after="80"/>
       </w:pPr>
       <w:r>
-        <w:t xml:space="preserve">Outreach CRM: status, sequence, touches, outcome</w:t>
-      </w:r>
-    </w:p>
-    <w:p>
-      <w:pPr>
-        <w:pStyle w:val="ListParagraph"/>
-        <w:numPr>
-          <w:ilvl w:val="0"/>
-          <w:numId w:val="3"/>
-        </w:numPr>
-        <w:spacing w:after="80"/>
-      </w:pPr>
-      <w:r>
-        <w:t xml:space="preserve">Margin analysis: entitled value, flip, retail commission</w:t>
-      </w:r>
-    </w:p>
-    <w:p>
-      <w:pPr>
-        <w:pStyle w:val="ListParagraph"/>
-        <w:numPr>
-          <w:ilvl w:val="0"/>
-          <w:numId w:val="3"/>
-        </w:numPr>
-        <w:spacing w:after="80"/>
-      </w:pPr>
-      <w:r>
-        <w:t xml:space="preserve">Internal Memo / Client Memo: printable deal summary</w:t>
+        <w:t xml:space="preserve">Owner contact panel (internal view shows phones; client view redacts)</w:t>
+      </w:r>
+    </w:p>
+    <w:p>
+      <w:pPr>
+        <w:pStyle w:val="ListParagraph"/>
+        <w:numPr>
+          <w:ilvl w:val="0"/>
+          <w:numId w:val="3"/>
+        </w:numPr>
+        <w:spacing w:after="80"/>
+      </w:pPr>
+      <w:r>
+        <w:t xml:space="preserve">Outreach CRM: contact status, sequence, touches</w:t>
+      </w:r>
+    </w:p>
+    <w:p>
+      <w:pPr>
+        <w:pStyle w:val="ListParagraph"/>
+        <w:numPr>
+          <w:ilvl w:val="0"/>
+          <w:numId w:val="3"/>
+        </w:numPr>
+        <w:spacing w:after="80"/>
+      </w:pPr>
+      <w:r>
+        <w:t xml:space="preserve">Margin analysis: entitled value, flip spread, retail commission</w:t>
+      </w:r>
+    </w:p>
+    <w:p>
+      <w:pPr>
+        <w:pStyle w:val="ListParagraph"/>
+        <w:numPr>
+          <w:ilvl w:val="0"/>
+          <w:numId w:val="3"/>
+        </w:numPr>
+        <w:spacing w:after="80"/>
+      </w:pPr>
+      <w:r>
+        <w:t xml:space="preserve">Deal Memo: printable PDF-style summary for partners or sellers</w:t>
       </w:r>
     </w:p>
     <w:p>
@@ -926,46 +1511,46 @@
         <w:spacing w:after="120"/>
       </w:pPr>
       <w:r>
-        <w:t xml:space="preserve">Assign each deal to the best path using the route dropdown on the card or in the modal.</w:t>
-      </w:r>
-    </w:p>
-    <w:p>
-      <w:pPr>
-        <w:pStyle w:val="ListParagraph"/>
-        <w:numPr>
-          <w:ilvl w:val="0"/>
-          <w:numId w:val="3"/>
-        </w:numPr>
-        <w:spacing w:after="80"/>
-      </w:pPr>
-      <w:r>
-        <w:t xml:space="preserve">Develop / Entitle: utilities and SF spillover support entitlement</w:t>
-      </w:r>
-    </w:p>
-    <w:p>
-      <w:pPr>
-        <w:pStyle w:val="ListParagraph"/>
-        <w:numPr>
-          <w:ilvl w:val="0"/>
-          <w:numId w:val="3"/>
-        </w:numPr>
-        <w:spacing w:after="80"/>
-      </w:pPr>
-      <w:r>
-        <w:t xml:space="preserve">Sell (Flip): comp-supported flip where sewer is the bottleneck</w:t>
-      </w:r>
-    </w:p>
-    <w:p>
-      <w:pPr>
-        <w:pStyle w:val="ListParagraph"/>
-        <w:numPr>
-          <w:ilvl w:val="0"/>
-          <w:numId w:val="3"/>
-        </w:numPr>
-        <w:spacing w:after="80"/>
-      </w:pPr>
-      <w:r>
-        <w:t xml:space="preserve">Retail: smaller tracts or brokerage commission plays</w:t>
+        <w:t xml:space="preserve">Every deal gets a route — use the dropdown on the card or in the modal.</w:t>
+      </w:r>
+    </w:p>
+    <w:p>
+      <w:pPr>
+        <w:pStyle w:val="ListParagraph"/>
+        <w:numPr>
+          <w:ilvl w:val="0"/>
+          <w:numId w:val="3"/>
+        </w:numPr>
+        <w:spacing w:after="80"/>
+      </w:pPr>
+      <w:r>
+        <w:t xml:space="preserve">Develop / Entitle: sewer/utilities and builder spillover support entitlement plays</w:t>
+      </w:r>
+    </w:p>
+    <w:p>
+      <w:pPr>
+        <w:pStyle w:val="ListParagraph"/>
+        <w:numPr>
+          <w:ilvl w:val="0"/>
+          <w:numId w:val="3"/>
+        </w:numPr>
+        <w:spacing w:after="80"/>
+      </w:pPr>
+      <w:r>
+        <w:t xml:space="preserve">Sell (Flip): comp-supported acquisition where entitlement is the bottleneck</w:t>
+      </w:r>
+    </w:p>
+    <w:p>
+      <w:pPr>
+        <w:pStyle w:val="ListParagraph"/>
+        <w:numPr>
+          <w:ilvl w:val="0"/>
+          <w:numId w:val="3"/>
+        </w:numPr>
+        <w:spacing w:after="80"/>
+      </w:pPr>
+      <w:r>
+        <w:t xml:space="preserve">Retail: smaller tracts or straight brokerage/listing plays</w:t>
       </w:r>
     </w:p>
     <w:p>
@@ -973,7 +1558,7 @@
         <w:spacing w:after="120"/>
       </w:pPr>
       <w:r>
-        <w:t xml:space="preserve">Use the Silos tab to see lane counts and acres at a glance.</w:t>
+        <w:t xml:space="preserve">Silos tab shows lane counts and total acres. Entitlement-bottlenecked tracts are excluded from outreach queues.</w:t>
       </w:r>
     </w:p>
     <w:p>
@@ -981,7 +1566,556 @@
         <w:pStyle w:val="Heading1"/>
       </w:pPr>
       <w:r>
-        <w:t xml:space="preserve">4. Outreach — Owner Contact</w:t>
+        <w:t xml:space="preserve">4. Outreach — Reach Owners</w:t>
+      </w:r>
+    </w:p>
+    <w:p>
+      <w:pPr>
+        <w:pStyle w:val="Heading2"/>
+      </w:pPr>
+      <w:r>
+        <w:t xml:space="preserve">Choose your path (important)</w:t>
+      </w:r>
+    </w:p>
+    <w:tbl>
+      <w:tblPr>
+        <w:tblW w:type="dxa" w:w="9360"/>
+        <w:tblBorders>
+          <w:top w:val="single" w:color="auto" w:sz="4"/>
+          <w:left w:val="single" w:color="auto" w:sz="4"/>
+          <w:bottom w:val="single" w:color="auto" w:sz="4"/>
+          <w:right w:val="single" w:color="auto" w:sz="4"/>
+          <w:insideH w:val="single" w:color="auto" w:sz="4"/>
+          <w:insideV w:val="single" w:color="auto" w:sz="4"/>
+        </w:tblBorders>
+      </w:tblPr>
+      <w:tblGrid>
+        <w:gridCol w:w="2200"/>
+        <w:gridCol w:w="3000"/>
+        <w:gridCol w:w="4160"/>
+      </w:tblGrid>
+      <w:tr>
+        <w:tc>
+          <w:tcPr>
+            <w:tcW w:type="dxa" w:w="2200"/>
+            <w:tcBorders>
+              <w:top w:val="single" w:color="CCCCCC" w:sz="1"/>
+              <w:left w:val="single" w:color="CCCCCC" w:sz="1"/>
+              <w:bottom w:val="single" w:color="CCCCCC" w:sz="1"/>
+              <w:right w:val="single" w:color="CCCCCC" w:sz="1"/>
+            </w:tcBorders>
+            <w:shd w:fill="E8E0D0" w:val="clear"/>
+            <w:tcMar>
+              <w:top w:type="dxa" w:w="80"/>
+              <w:left w:type="dxa" w:w="120"/>
+              <w:bottom w:type="dxa" w:w="80"/>
+              <w:right w:type="dxa" w:w="120"/>
+            </w:tcMar>
+          </w:tcPr>
+          <w:p>
+            <w:r>
+              <w:rPr>
+                <w:b/>
+                <w:bCs/>
+              </w:rPr>
+              <w:t xml:space="preserve">Method</w:t>
+            </w:r>
+          </w:p>
+        </w:tc>
+        <w:tc>
+          <w:tcPr>
+            <w:tcW w:type="dxa" w:w="3000"/>
+            <w:tcBorders>
+              <w:top w:val="single" w:color="CCCCCC" w:sz="1"/>
+              <w:left w:val="single" w:color="CCCCCC" w:sz="1"/>
+              <w:bottom w:val="single" w:color="CCCCCC" w:sz="1"/>
+              <w:right w:val="single" w:color="CCCCCC" w:sz="1"/>
+            </w:tcBorders>
+            <w:shd w:fill="E8E0D0" w:val="clear"/>
+            <w:tcMar>
+              <w:top w:type="dxa" w:w="80"/>
+              <w:left w:type="dxa" w:w="120"/>
+              <w:bottom w:type="dxa" w:w="80"/>
+              <w:right w:type="dxa" w:w="120"/>
+            </w:tcMar>
+          </w:tcPr>
+          <w:p>
+            <w:r>
+              <w:rPr>
+                <w:b/>
+                <w:bCs/>
+              </w:rPr>
+              <w:t xml:space="preserve">DNC vendor needed?</w:t>
+            </w:r>
+          </w:p>
+        </w:tc>
+        <w:tc>
+          <w:tcPr>
+            <w:tcW w:type="dxa" w:w="4160"/>
+            <w:tcBorders>
+              <w:top w:val="single" w:color="CCCCCC" w:sz="1"/>
+              <w:left w:val="single" w:color="CCCCCC" w:sz="1"/>
+              <w:bottom w:val="single" w:color="CCCCCC" w:sz="1"/>
+              <w:right w:val="single" w:color="CCCCCC" w:sz="1"/>
+            </w:tcBorders>
+            <w:shd w:fill="E8E0D0" w:val="clear"/>
+            <w:tcMar>
+              <w:top w:type="dxa" w:w="80"/>
+              <w:left w:type="dxa" w:w="120"/>
+              <w:bottom w:type="dxa" w:w="80"/>
+              <w:right w:type="dxa" w:w="120"/>
+            </w:tcMar>
+          </w:tcPr>
+          <w:p>
+            <w:r>
+              <w:rPr>
+                <w:b/>
+                <w:bCs/>
+              </w:rPr>
+              <w:t xml:space="preserve">When to use</w:t>
+            </w:r>
+          </w:p>
+        </w:tc>
+      </w:tr>
+      <w:tr>
+        <w:tc>
+          <w:tcPr>
+            <w:tcW w:type="dxa" w:w="2200"/>
+            <w:tcBorders>
+              <w:top w:val="single" w:color="CCCCCC" w:sz="1"/>
+              <w:left w:val="single" w:color="CCCCCC" w:sz="1"/>
+              <w:bottom w:val="single" w:color="CCCCCC" w:sz="1"/>
+              <w:right w:val="single" w:color="CCCCCC" w:sz="1"/>
+            </w:tcBorders>
+            <w:shd w:fill="FFFFFF" w:val="clear"/>
+            <w:tcMar>
+              <w:top w:type="dxa" w:w="80"/>
+              <w:left w:type="dxa" w:w="120"/>
+              <w:bottom w:type="dxa" w:w="80"/>
+              <w:right w:type="dxa" w:w="120"/>
+            </w:tcMar>
+          </w:tcPr>
+          <w:p>
+            <w:r>
+              <w:rPr>
+                <w:b w:val="false"/>
+                <w:bCs w:val="false"/>
+              </w:rPr>
+              <w:t xml:space="preserve">Direct mail (recommended)</w:t>
+            </w:r>
+          </w:p>
+        </w:tc>
+        <w:tc>
+          <w:tcPr>
+            <w:tcW w:type="dxa" w:w="3000"/>
+            <w:tcBorders>
+              <w:top w:val="single" w:color="CCCCCC" w:sz="1"/>
+              <w:left w:val="single" w:color="CCCCCC" w:sz="1"/>
+              <w:bottom w:val="single" w:color="CCCCCC" w:sz="1"/>
+              <w:right w:val="single" w:color="CCCCCC" w:sz="1"/>
+            </w:tcBorders>
+            <w:shd w:fill="FFFFFF" w:val="clear"/>
+            <w:tcMar>
+              <w:top w:type="dxa" w:w="80"/>
+              <w:left w:type="dxa" w:w="120"/>
+              <w:bottom w:type="dxa" w:w="80"/>
+              <w:right w:type="dxa" w:w="120"/>
+            </w:tcMar>
+          </w:tcPr>
+          <w:p>
+            <w:r>
+              <w:rPr>
+                <w:b w:val="false"/>
+                <w:bCs w:val="false"/>
+              </w:rPr>
+              <w:t xml:space="preserve">No</w:t>
+            </w:r>
+          </w:p>
+        </w:tc>
+        <w:tc>
+          <w:tcPr>
+            <w:tcW w:type="dxa" w:w="4160"/>
+            <w:tcBorders>
+              <w:top w:val="single" w:color="CCCCCC" w:sz="1"/>
+              <w:left w:val="single" w:color="CCCCCC" w:sz="1"/>
+              <w:bottom w:val="single" w:color="CCCCCC" w:sz="1"/>
+              <w:right w:val="single" w:color="CCCCCC" w:sz="1"/>
+            </w:tcBorders>
+            <w:shd w:fill="FFFFFF" w:val="clear"/>
+            <w:tcMar>
+              <w:top w:type="dxa" w:w="80"/>
+              <w:left w:type="dxa" w:w="120"/>
+              <w:bottom w:type="dxa" w:w="80"/>
+              <w:right w:type="dxa" w:w="120"/>
+            </w:tcMar>
+          </w:tcPr>
+          <w:p>
+            <w:r>
+              <w:rPr>
+                <w:b w:val="false"/>
+                <w:bCs w:val="false"/>
+              </w:rPr>
+              <w:t xml:space="preserve">Letters and Avery labels — start here</w:t>
+            </w:r>
+          </w:p>
+        </w:tc>
+      </w:tr>
+      <w:tr>
+        <w:tc>
+          <w:tcPr>
+            <w:tcW w:type="dxa" w:w="2200"/>
+            <w:tcBorders>
+              <w:top w:val="single" w:color="CCCCCC" w:sz="1"/>
+              <w:left w:val="single" w:color="CCCCCC" w:sz="1"/>
+              <w:bottom w:val="single" w:color="CCCCCC" w:sz="1"/>
+              <w:right w:val="single" w:color="CCCCCC" w:sz="1"/>
+            </w:tcBorders>
+            <w:shd w:fill="FFFFFF" w:val="clear"/>
+            <w:tcMar>
+              <w:top w:type="dxa" w:w="80"/>
+              <w:left w:type="dxa" w:w="120"/>
+              <w:bottom w:type="dxa" w:w="80"/>
+              <w:right w:type="dxa" w:w="120"/>
+            </w:tcMar>
+          </w:tcPr>
+          <w:p>
+            <w:r>
+              <w:rPr>
+                <w:b w:val="false"/>
+                <w:bCs w:val="false"/>
+              </w:rPr>
+              <w:t xml:space="preserve">Cold texts</w:t>
+            </w:r>
+          </w:p>
+        </w:tc>
+        <w:tc>
+          <w:tcPr>
+            <w:tcW w:type="dxa" w:w="3000"/>
+            <w:tcBorders>
+              <w:top w:val="single" w:color="CCCCCC" w:sz="1"/>
+              <w:left w:val="single" w:color="CCCCCC" w:sz="1"/>
+              <w:bottom w:val="single" w:color="CCCCCC" w:sz="1"/>
+              <w:right w:val="single" w:color="CCCCCC" w:sz="1"/>
+            </w:tcBorders>
+            <w:shd w:fill="FFFFFF" w:val="clear"/>
+            <w:tcMar>
+              <w:top w:type="dxa" w:w="80"/>
+              <w:left w:type="dxa" w:w="120"/>
+              <w:bottom w:type="dxa" w:w="80"/>
+              <w:right w:type="dxa" w:w="120"/>
+            </w:tcMar>
+          </w:tcPr>
+          <w:p>
+            <w:r>
+              <w:rPr>
+                <w:b w:val="false"/>
+                <w:bCs w:val="false"/>
+              </w:rPr>
+              <w:t xml:space="preserve">Yes (e.g. DNCScrub)</w:t>
+            </w:r>
+          </w:p>
+        </w:tc>
+        <w:tc>
+          <w:tcPr>
+            <w:tcW w:type="dxa" w:w="4160"/>
+            <w:tcBorders>
+              <w:top w:val="single" w:color="CCCCCC" w:sz="1"/>
+              <w:left w:val="single" w:color="CCCCCC" w:sz="1"/>
+              <w:bottom w:val="single" w:color="CCCCCC" w:sz="1"/>
+              <w:right w:val="single" w:color="CCCCCC" w:sz="1"/>
+            </w:tcBorders>
+            <w:shd w:fill="FFFFFF" w:val="clear"/>
+            <w:tcMar>
+              <w:top w:type="dxa" w:w="80"/>
+              <w:left w:type="dxa" w:w="120"/>
+              <w:bottom w:type="dxa" w:w="80"/>
+              <w:right w:type="dxa" w:w="120"/>
+            </w:tcMar>
+          </w:tcPr>
+          <w:p>
+            <w:r>
+              <w:rPr>
+                <w:b w:val="false"/>
+                <w:bCs w:val="false"/>
+              </w:rPr>
+              <w:t xml:space="preserve">Only with federal DNC scrub configured</w:t>
+            </w:r>
+          </w:p>
+        </w:tc>
+      </w:tr>
+      <w:tr>
+        <w:tc>
+          <w:tcPr>
+            <w:tcW w:type="dxa" w:w="2200"/>
+            <w:tcBorders>
+              <w:top w:val="single" w:color="CCCCCC" w:sz="1"/>
+              <w:left w:val="single" w:color="CCCCCC" w:sz="1"/>
+              <w:bottom w:val="single" w:color="CCCCCC" w:sz="1"/>
+              <w:right w:val="single" w:color="CCCCCC" w:sz="1"/>
+            </w:tcBorders>
+            <w:shd w:fill="FFFFFF" w:val="clear"/>
+            <w:tcMar>
+              <w:top w:type="dxa" w:w="80"/>
+              <w:left w:type="dxa" w:w="120"/>
+              <w:bottom w:type="dxa" w:w="80"/>
+              <w:right w:type="dxa" w:w="120"/>
+            </w:tcMar>
+          </w:tcPr>
+          <w:p>
+            <w:r>
+              <w:rPr>
+                <w:b w:val="false"/>
+                <w:bCs w:val="false"/>
+              </w:rPr>
+              <w:t xml:space="preserve">Inbound website leads</w:t>
+            </w:r>
+          </w:p>
+        </w:tc>
+        <w:tc>
+          <w:tcPr>
+            <w:tcW w:type="dxa" w:w="3000"/>
+            <w:tcBorders>
+              <w:top w:val="single" w:color="CCCCCC" w:sz="1"/>
+              <w:left w:val="single" w:color="CCCCCC" w:sz="1"/>
+              <w:bottom w:val="single" w:color="CCCCCC" w:sz="1"/>
+              <w:right w:val="single" w:color="CCCCCC" w:sz="1"/>
+            </w:tcBorders>
+            <w:shd w:fill="FFFFFF" w:val="clear"/>
+            <w:tcMar>
+              <w:top w:type="dxa" w:w="80"/>
+              <w:left w:type="dxa" w:w="120"/>
+              <w:bottom w:type="dxa" w:w="80"/>
+              <w:right w:type="dxa" w:w="120"/>
+            </w:tcMar>
+          </w:tcPr>
+          <w:p>
+            <w:r>
+              <w:rPr>
+                <w:b w:val="false"/>
+                <w:bCs w:val="false"/>
+              </w:rPr>
+              <w:t xml:space="preserve">No</w:t>
+            </w:r>
+          </w:p>
+        </w:tc>
+        <w:tc>
+          <w:tcPr>
+            <w:tcW w:type="dxa" w:w="4160"/>
+            <w:tcBorders>
+              <w:top w:val="single" w:color="CCCCCC" w:sz="1"/>
+              <w:left w:val="single" w:color="CCCCCC" w:sz="1"/>
+              <w:bottom w:val="single" w:color="CCCCCC" w:sz="1"/>
+              <w:right w:val="single" w:color="CCCCCC" w:sz="1"/>
+            </w:tcBorders>
+            <w:shd w:fill="FFFFFF" w:val="clear"/>
+            <w:tcMar>
+              <w:top w:type="dxa" w:w="80"/>
+              <w:left w:type="dxa" w:w="120"/>
+              <w:bottom w:type="dxa" w:w="80"/>
+              <w:right w:type="dxa" w:w="120"/>
+            </w:tcMar>
+          </w:tcPr>
+          <w:p>
+            <w:r>
+              <w:rPr>
+                <w:b w:val="false"/>
+                <w:bCs w:val="false"/>
+              </w:rPr>
+              <w:t xml:space="preserve">They filled out your form — call or email back</w:t>
+            </w:r>
+          </w:p>
+        </w:tc>
+      </w:tr>
+    </w:tbl>
+    <w:p>
+      <w:pPr>
+        <w:spacing w:after="120"/>
+      </w:pPr>
+      <w:r>
+        <w:t xml:space="preserve">The app defaults to direct mail. The federal Do Not Call list does not apply to postal mail. Cold unsolicited texts carry TCPA risk ($500–$50,000+ per violation) without proper scrubbing.</w:t>
+      </w:r>
+    </w:p>
+    <w:p>
+      <w:pPr>
+        <w:pStyle w:val="Heading2"/>
+      </w:pPr>
+      <w:r>
+        <w:t xml:space="preserve">Direct mail workflow (2 steps)</w:t>
+      </w:r>
+    </w:p>
+    <w:p>
+      <w:pPr>
+        <w:pStyle w:val="ListParagraph"/>
+        <w:numPr>
+          <w:ilvl w:val="0"/>
+          <w:numId w:val="2"/>
+        </w:numPr>
+        <w:spacing w:after="80"/>
+      </w:pPr>
+      <w:r>
+        <w:t xml:space="preserve">Go to Outreach tab (mail tab is selected by default).</w:t>
+      </w:r>
+    </w:p>
+    <w:p>
+      <w:pPr>
+        <w:pStyle w:val="ListParagraph"/>
+        <w:numPr>
+          <w:ilvl w:val="0"/>
+          <w:numId w:val="2"/>
+        </w:numPr>
+        <w:spacing w:after="80"/>
+      </w:pPr>
+      <w:r>
+        <w:t xml:space="preserve">Click Build Mail List.</w:t>
+      </w:r>
+    </w:p>
+    <w:p>
+      <w:pPr>
+        <w:pStyle w:val="ListParagraph"/>
+        <w:numPr>
+          <w:ilvl w:val="0"/>
+          <w:numId w:val="2"/>
+        </w:numPr>
+        <w:spacing w:after="80"/>
+      </w:pPr>
+      <w:r>
+        <w:t xml:space="preserve">Step 1 — Pick tracts: check eligible deals (not entitlement-bottlenecked, has owner contact).</w:t>
+      </w:r>
+    </w:p>
+    <w:p>
+      <w:pPr>
+        <w:pStyle w:val="ListParagraph"/>
+        <w:numPr>
+          <w:ilvl w:val="0"/>
+          <w:numId w:val="2"/>
+        </w:numPr>
+        <w:spacing w:after="80"/>
+      </w:pPr>
+      <w:r>
+        <w:t xml:space="preserve">Click Build Mail Queue — no DNC scrub step.</w:t>
+      </w:r>
+    </w:p>
+    <w:p>
+      <w:pPr>
+        <w:pStyle w:val="ListParagraph"/>
+        <w:numPr>
+          <w:ilvl w:val="0"/>
+          <w:numId w:val="2"/>
+        </w:numPr>
+        <w:spacing w:after="80"/>
+      </w:pPr>
+      <w:r>
+        <w:t xml:space="preserve">Export CSV or Print Labels for Avery-style mail merge.</w:t>
+      </w:r>
+    </w:p>
+    <w:p>
+      <w:pPr>
+        <w:spacing w:after="120"/>
+      </w:pPr>
+      <w:r>
+        <w:t xml:space="preserve">Eligible deals need Forewarn owner contact and must not be flagged as entitlement bottlenecked.</w:t>
+      </w:r>
+    </w:p>
+    <w:p>
+      <w:pPr>
+        <w:pStyle w:val="Heading2"/>
+      </w:pPr>
+      <w:r>
+        <w:t xml:space="preserve">Cold texts workflow (advanced, 3 steps)</w:t>
+      </w:r>
+    </w:p>
+    <w:p>
+      <w:pPr>
+        <w:pStyle w:val="ListParagraph"/>
+        <w:numPr>
+          <w:ilvl w:val="0"/>
+          <w:numId w:val="2"/>
+        </w:numPr>
+        <w:spacing w:after="80"/>
+      </w:pPr>
+      <w:r>
+        <w:t xml:space="preserve">In Outreach, switch to the Cold texts tab OR choose Cold texts in the wizard mode picker.</w:t>
+      </w:r>
+    </w:p>
+    <w:p>
+      <w:pPr>
+        <w:pStyle w:val="ListParagraph"/>
+        <w:numPr>
+          <w:ilvl w:val="0"/>
+          <w:numId w:val="2"/>
+        </w:numPr>
+        <w:spacing w:after="80"/>
+      </w:pPr>
+      <w:r>
+        <w:t xml:space="preserve">Click Build Text List.</w:t>
+      </w:r>
+    </w:p>
+    <w:p>
+      <w:pPr>
+        <w:pStyle w:val="ListParagraph"/>
+        <w:numPr>
+          <w:ilvl w:val="0"/>
+          <w:numId w:val="2"/>
+        </w:numPr>
+        <w:spacing w:after="80"/>
+      </w:pPr>
+      <w:r>
+        <w:t xml:space="preserve">Step 1 — Pick tracts. Step 2 — Run Federal DNC Registry Scrub (requires DNC_SCRUB_API_KEY on Vercel). Step 3 — Review text queue.</w:t>
+      </w:r>
+    </w:p>
+    <w:p>
+      <w:pPr>
+        <w:pStyle w:val="ListParagraph"/>
+        <w:numPr>
+          <w:ilvl w:val="0"/>
+          <w:numId w:val="3"/>
+        </w:numPr>
+        <w:spacing w:after="80"/>
+      </w:pPr>
+      <w:r>
+        <w:t xml:space="preserve">Only DNC-cleared numbers can be queued.</w:t>
+      </w:r>
+    </w:p>
+    <w:p>
+      <w:pPr>
+        <w:pStyle w:val="ListParagraph"/>
+        <w:numPr>
+          <w:ilvl w:val="0"/>
+          <w:numId w:val="3"/>
+        </w:numPr>
+        <w:spacing w:after="80"/>
+      </w:pPr>
+      <w:r>
+        <w:t xml:space="preserve">Blocked numbers show DNC — DO NOT CONTACT.</w:t>
+      </w:r>
+    </w:p>
+    <w:p>
+      <w:pPr>
+        <w:pStyle w:val="ListParagraph"/>
+        <w:numPr>
+          <w:ilvl w:val="0"/>
+          <w:numId w:val="3"/>
+        </w:numPr>
+        <w:spacing w:after="80"/>
+      </w:pPr>
+      <w:r>
+        <w:t xml:space="preserve">Edit template with {{owner_name}} and {{county}} merge fields.</w:t>
+      </w:r>
+    </w:p>
+    <w:p>
+      <w:pPr>
+        <w:spacing w:after="120"/>
+      </w:pPr>
+      <w:r>
+        <w:t xml:space="preserve">Until a DNC vendor API key is configured, scrub runs in mock mode for testing only — do not send real cold texts against mock results.</w:t>
+      </w:r>
+    </w:p>
+    <w:p>
+      <w:pPr>
+        <w:pStyle w:val="Heading1"/>
+      </w:pPr>
+      <w:r>
+        <w:t xml:space="preserve">5. Intel — Moat Intelligence</w:t>
       </w:r>
     </w:p>
     <w:p>
@@ -989,46 +2123,46 @@
         <w:pStyle w:val="Heading3"/>
       </w:pPr>
       <w:r>
-        <w:t xml:space="preserve">Build Outreach List wizard (3 steps — cannot skip)</w:t>
-      </w:r>
-    </w:p>
-    <w:p>
-      <w:pPr>
-        <w:pStyle w:val="ListParagraph"/>
-        <w:numPr>
-          <w:ilvl w:val="0"/>
-          <w:numId w:val="2"/>
-        </w:numPr>
-        <w:spacing w:after="80"/>
-      </w:pPr>
-      <w:r>
-        <w:t xml:space="preserve">Filter: only enriched, non-bottlenecked deals with owner contact are eligible.</w:t>
-      </w:r>
-    </w:p>
-    <w:p>
-      <w:pPr>
-        <w:pStyle w:val="ListParagraph"/>
-        <w:numPr>
-          <w:ilvl w:val="0"/>
-          <w:numId w:val="2"/>
-        </w:numPr>
-        <w:spacing w:after="80"/>
-      </w:pPr>
-      <w:r>
-        <w:t xml:space="preserve">DNC Scrub: run Federal DNC Registry scrub on every number (required).</w:t>
-      </w:r>
-    </w:p>
-    <w:p>
-      <w:pPr>
-        <w:pStyle w:val="ListParagraph"/>
-        <w:numPr>
-          <w:ilvl w:val="0"/>
-          <w:numId w:val="2"/>
-        </w:numPr>
-        <w:spacing w:after="80"/>
-      </w:pPr>
-      <w:r>
-        <w:t xml:space="preserve">Queue: cleared numbers go to text queue; mail pieces go to direct mail.</w:t>
+        <w:t xml:space="preserve">Comp Lake</w:t>
+      </w:r>
+    </w:p>
+    <w:p>
+      <w:pPr>
+        <w:pStyle w:val="ListParagraph"/>
+        <w:numPr>
+          <w:ilvl w:val="0"/>
+          <w:numId w:val="3"/>
+        </w:numPr>
+        <w:spacing w:after="80"/>
+      </w:pPr>
+      <w:r>
+        <w:t xml:space="preserve">+ Log Comp: record off-market sales (county, submarket, $/ac, buyer, date, notes).</w:t>
+      </w:r>
+    </w:p>
+    <w:p>
+      <w:pPr>
+        <w:pStyle w:val="ListParagraph"/>
+        <w:numPr>
+          <w:ilvl w:val="0"/>
+          <w:numId w:val="3"/>
+        </w:numPr>
+        <w:spacing w:after="80"/>
+      </w:pPr>
+      <w:r>
+        <w:t xml:space="preserve">Comps feed entitlement scoring and margin bands for that county.</w:t>
+      </w:r>
+    </w:p>
+    <w:p>
+      <w:pPr>
+        <w:pStyle w:val="ListParagraph"/>
+        <w:numPr>
+          <w:ilvl w:val="0"/>
+          <w:numId w:val="3"/>
+        </w:numPr>
+        <w:spacing w:after="80"/>
+      </w:pPr>
+      <w:r>
+        <w:t xml:space="preserve">Texas non-disclosure: logged comps are proprietary — this is your moat.</w:t>
       </w:r>
     </w:p>
     <w:p>
@@ -1036,46 +2170,15 @@
         <w:pStyle w:val="Heading3"/>
       </w:pPr>
       <w:r>
-        <w:t xml:space="preserve">Text queue</w:t>
-      </w:r>
-    </w:p>
-    <w:p>
-      <w:pPr>
-        <w:pStyle w:val="ListParagraph"/>
-        <w:numPr>
-          <w:ilvl w:val="0"/>
-          <w:numId w:val="3"/>
-        </w:numPr>
-        <w:spacing w:after="80"/>
-      </w:pPr>
-      <w:r>
-        <w:t xml:space="preserve">Edit the template — use {{owner_name}} and {{county}} merge fields.</w:t>
-      </w:r>
-    </w:p>
-    <w:p>
-      <w:pPr>
-        <w:pStyle w:val="ListParagraph"/>
-        <w:numPr>
-          <w:ilvl w:val="0"/>
-          <w:numId w:val="3"/>
-        </w:numPr>
-        <w:spacing w:after="80"/>
-      </w:pPr>
-      <w:r>
-        <w:t xml:space="preserve">Only DNC-cleared numbers can be queued.</w:t>
-      </w:r>
-    </w:p>
-    <w:p>
-      <w:pPr>
-        <w:pStyle w:val="ListParagraph"/>
-        <w:numPr>
-          <w:ilvl w:val="0"/>
-          <w:numId w:val="3"/>
-        </w:numPr>
-        <w:spacing w:after="80"/>
-      </w:pPr>
-      <w:r>
-        <w:t xml:space="preserve">Blocked numbers stay labeled DNC — DO NOT CONTACT.</w:t>
+        <w:t xml:space="preserve">Plat &amp; Development Alerts</w:t>
+      </w:r>
+    </w:p>
+    <w:p>
+      <w:pPr>
+        <w:spacing w:after="120"/>
+      </w:pPr>
+      <w:r>
+        <w:t xml:space="preserve">Plat filings within ~8 miles of pipeline deals in the same county. Builder adjacency often drives the thesis.</w:t>
       </w:r>
     </w:p>
     <w:p>
@@ -1083,33 +2186,91 @@
         <w:pStyle w:val="Heading3"/>
       </w:pPr>
       <w:r>
-        <w:t xml:space="preserve">Direct mail</w:t>
-      </w:r>
-    </w:p>
-    <w:p>
-      <w:pPr>
-        <w:pStyle w:val="ListParagraph"/>
-        <w:numPr>
-          <w:ilvl w:val="0"/>
-          <w:numId w:val="3"/>
-        </w:numPr>
-        <w:spacing w:after="80"/>
-      </w:pPr>
-      <w:r>
-        <w:t xml:space="preserve">Export CSV for mail merge.</w:t>
-      </w:r>
-    </w:p>
-    <w:p>
-      <w:pPr>
-        <w:pStyle w:val="ListParagraph"/>
-        <w:numPr>
-          <w:ilvl w:val="0"/>
-          <w:numId w:val="3"/>
-        </w:numPr>
-        <w:spacing w:after="80"/>
-      </w:pPr>
-      <w:r>
-        <w:t xml:space="preserve">Print Labels opens a print-ready Avery-style label view.</w:t>
+        <w:t xml:space="preserve">Website Leads</w:t>
+      </w:r>
+    </w:p>
+    <w:p>
+      <w:pPr>
+        <w:spacing w:after="120"/>
+      </w:pPr>
+      <w:r>
+        <w:t xml:space="preserve">Same inbound leads from barntobank.com — refresh, review, and mark contacted/converted from Intel or Intake.</w:t>
+      </w:r>
+    </w:p>
+    <w:p>
+      <w:pPr>
+        <w:pStyle w:val="Heading3"/>
+      </w:pPr>
+      <w:r>
+        <w:t xml:space="preserve">Outreach Audit Log</w:t>
+      </w:r>
+    </w:p>
+    <w:p>
+      <w:pPr>
+        <w:spacing w:after="120"/>
+      </w:pPr>
+      <w:r>
+        <w:t xml:space="preserve">Timestamped trail: DNC scrubs, queued texts, mail queue builds, comp logs, bundle import/export, cloud sync.</w:t>
+      </w:r>
+    </w:p>
+    <w:p>
+      <w:pPr>
+        <w:pStyle w:val="Heading3"/>
+      </w:pPr>
+      <w:r>
+        <w:t xml:space="preserve">Team Moat Sync</w:t>
+      </w:r>
+    </w:p>
+    <w:p>
+      <w:pPr>
+        <w:pStyle w:val="ListParagraph"/>
+        <w:numPr>
+          <w:ilvl w:val="0"/>
+          <w:numId w:val="3"/>
+        </w:numPr>
+        <w:spacing w:after="80"/>
+      </w:pPr>
+      <w:r>
+        <w:t xml:space="preserve">Cloud Sync: merges local browser data with Supabase team bundle (deals, comps, audit, outreach).</w:t>
+      </w:r>
+    </w:p>
+    <w:p>
+      <w:pPr>
+        <w:pStyle w:val="ListParagraph"/>
+        <w:numPr>
+          <w:ilvl w:val="0"/>
+          <w:numId w:val="3"/>
+        </w:numPr>
+        <w:spacing w:after="80"/>
+      </w:pPr>
+      <w:r>
+        <w:t xml:space="preserve">Export Bundle: download JSON backup or email to a partner.</w:t>
+      </w:r>
+    </w:p>
+    <w:p>
+      <w:pPr>
+        <w:pStyle w:val="ListParagraph"/>
+        <w:numPr>
+          <w:ilvl w:val="0"/>
+          <w:numId w:val="3"/>
+        </w:numPr>
+        <w:spacing w:after="80"/>
+      </w:pPr>
+      <w:r>
+        <w:t xml:space="preserve">Import Bundle: upload a teammate's JSON file.</w:t>
+      </w:r>
+    </w:p>
+    <w:p>
+      <w:pPr>
+        <w:pStyle w:val="ListParagraph"/>
+        <w:numPr>
+          <w:ilvl w:val="0"/>
+          <w:numId w:val="3"/>
+        </w:numPr>
+        <w:spacing w:after="80"/>
+      </w:pPr>
+      <w:r>
+        <w:t xml:space="preserve">Status bar shows Supabase connection and last sync time.</w:t>
       </w:r>
     </w:p>
     <w:p>
@@ -1117,62 +2278,80 @@
         <w:pStyle w:val="Heading1"/>
       </w:pPr>
       <w:r>
-        <w:t xml:space="preserve">5. Intel — Moat Intelligence</w:t>
-      </w:r>
-    </w:p>
-    <w:p>
-      <w:pPr>
-        <w:pStyle w:val="Heading3"/>
-      </w:pPr>
-      <w:r>
-        <w:t xml:space="preserve">Comp Lake</w:t>
-      </w:r>
-    </w:p>
-    <w:p>
-      <w:pPr>
-        <w:pStyle w:val="ListParagraph"/>
-        <w:numPr>
-          <w:ilvl w:val="0"/>
-          <w:numId w:val="3"/>
-        </w:numPr>
-        <w:spacing w:after="80"/>
-      </w:pPr>
-      <w:r>
-        <w:t xml:space="preserve">Click + Log Comp to record off-market sales (county, submarket, $/ac, buyer, date).</w:t>
-      </w:r>
-    </w:p>
-    <w:p>
-      <w:pPr>
-        <w:pStyle w:val="ListParagraph"/>
-        <w:numPr>
-          <w:ilvl w:val="0"/>
-          <w:numId w:val="3"/>
-        </w:numPr>
-        <w:spacing w:after="80"/>
-      </w:pPr>
-      <w:r>
-        <w:t xml:space="preserve">Comps feed entitlement scoring and margin analysis for that county.</w:t>
-      </w:r>
-    </w:p>
-    <w:p>
-      <w:pPr>
-        <w:pStyle w:val="ListParagraph"/>
-        <w:numPr>
-          <w:ilvl w:val="0"/>
-          <w:numId w:val="3"/>
-        </w:numPr>
-        <w:spacing w:after="80"/>
-      </w:pPr>
-      <w:r>
-        <w:t xml:space="preserve">Texas non-disclosure: every comp you log is proprietary moat data.</w:t>
-      </w:r>
-    </w:p>
-    <w:p>
-      <w:pPr>
-        <w:pStyle w:val="Heading3"/>
-      </w:pPr>
-      <w:r>
-        <w:t xml:space="preserve">Plat &amp; Development Alerts</w:t>
+        <w:t xml:space="preserve">6. Working With Your Team</w:t>
+      </w:r>
+    </w:p>
+    <w:p>
+      <w:pPr>
+        <w:pStyle w:val="ListParagraph"/>
+        <w:numPr>
+          <w:ilvl w:val="0"/>
+          <w:numId w:val="3"/>
+        </w:numPr>
+        <w:spacing w:after="80"/>
+      </w:pPr>
+      <w:r>
+        <w:t xml:space="preserve">Copy App Link in header — sends partners to barntobank.com/app.</w:t>
+      </w:r>
+    </w:p>
+    <w:p>
+      <w:pPr>
+        <w:pStyle w:val="ListParagraph"/>
+        <w:numPr>
+          <w:ilvl w:val="0"/>
+          <w:numId w:val="3"/>
+        </w:numPr>
+        <w:spacing w:after="80"/>
+      </w:pPr>
+      <w:r>
+        <w:t xml:space="preserve">Each person signs in separately; id.land tokens are per-browser.</w:t>
+      </w:r>
+    </w:p>
+    <w:p>
+      <w:pPr>
+        <w:pStyle w:val="ListParagraph"/>
+        <w:numPr>
+          <w:ilvl w:val="0"/>
+          <w:numId w:val="3"/>
+        </w:numPr>
+        <w:spacing w:after="80"/>
+      </w:pPr>
+      <w:r>
+        <w:t xml:space="preserve">Cloud Sync on Intel tab merges everyone's work into one team moat.</w:t>
+      </w:r>
+    </w:p>
+    <w:p>
+      <w:pPr>
+        <w:pStyle w:val="ListParagraph"/>
+        <w:numPr>
+          <w:ilvl w:val="0"/>
+          <w:numId w:val="3"/>
+        </w:numPr>
+        <w:spacing w:after="80"/>
+      </w:pPr>
+      <w:r>
+        <w:t xml:space="preserve">Feature Request: submit product ideas from the header.</w:t>
+      </w:r>
+    </w:p>
+    <w:p>
+      <w:pPr>
+        <w:pStyle w:val="ListParagraph"/>
+        <w:numPr>
+          <w:ilvl w:val="0"/>
+          <w:numId w:val="3"/>
+        </w:numPr>
+        <w:spacing w:after="80"/>
+      </w:pPr>
+      <w:r>
+        <w:t xml:space="preserve">Works on iPhone and desktop — use ← Site to return to the public marketing page.</w:t>
+      </w:r>
+    </w:p>
+    <w:p>
+      <w:pPr>
+        <w:pStyle w:val="Heading1"/>
+      </w:pPr>
+      <w:r>
+        <w:t xml:space="preserve">7. Public Marketing Site</w:t>
       </w:r>
     </w:p>
     <w:p>
@@ -1180,15 +2359,67 @@
         <w:spacing w:after="120"/>
       </w:pPr>
       <w:r>
-        <w:t xml:space="preserve">Shows plat filings within 8 miles of pipeline deals in the same county. Adjacency often drives the thesis.</w:t>
-      </w:r>
-    </w:p>
-    <w:p>
-      <w:pPr>
-        <w:pStyle w:val="Heading3"/>
-      </w:pPr>
-      <w:r>
-        <w:t xml:space="preserve">Outreach Audit Log</w:t>
+        <w:t xml:space="preserve">The public site at https://barntobank.com is separate from the staff app.</w:t>
+      </w:r>
+    </w:p>
+    <w:p>
+      <w:pPr>
+        <w:pStyle w:val="ListParagraph"/>
+        <w:numPr>
+          <w:ilvl w:val="0"/>
+          <w:numId w:val="3"/>
+        </w:numPr>
+        <w:spacing w:after="80"/>
+      </w:pPr>
+      <w:r>
+        <w:t xml:space="preserve">Visitors see farms, ranches, and land positioning for Central Texas.</w:t>
+      </w:r>
+    </w:p>
+    <w:p>
+      <w:pPr>
+        <w:pStyle w:val="ListParagraph"/>
+        <w:numPr>
+          <w:ilvl w:val="0"/>
+          <w:numId w:val="3"/>
+        </w:numPr>
+        <w:spacing w:after="80"/>
+      </w:pPr>
+      <w:r>
+        <w:t xml:space="preserve">Contact form submits to /api/leads → Website Leads in the staff app.</w:t>
+      </w:r>
+    </w:p>
+    <w:p>
+      <w:pPr>
+        <w:pStyle w:val="ListParagraph"/>
+        <w:numPr>
+          <w:ilvl w:val="0"/>
+          <w:numId w:val="3"/>
+        </w:numPr>
+        <w:spacing w:after="80"/>
+      </w:pPr>
+      <w:r>
+        <w:t xml:space="preserve">No password required on the public site.</w:t>
+      </w:r>
+    </w:p>
+    <w:p>
+      <w:pPr>
+        <w:pStyle w:val="ListParagraph"/>
+        <w:numPr>
+          <w:ilvl w:val="0"/>
+          <w:numId w:val="3"/>
+        </w:numPr>
+        <w:spacing w:after="80"/>
+      </w:pPr>
+      <w:r>
+        <w:t xml:space="preserve">Staff reach the app via /app or the login link.</w:t>
+      </w:r>
+    </w:p>
+    <w:p>
+      <w:pPr>
+        <w:pStyle w:val="Heading1"/>
+      </w:pPr>
+      <w:r>
+        <w:t xml:space="preserve">8. Counties &amp; Data Sources</w:t>
       </w:r>
     </w:p>
     <w:p>
@@ -1196,62 +2427,85 @@
         <w:spacing w:after="120"/>
       </w:pPr>
       <w:r>
-        <w:t xml:space="preserve">TCPA trail: DNC scrubs, queued texts, comp logs, bundle import/export, cloud sync — all timestamped.</w:t>
-      </w:r>
-    </w:p>
-    <w:p>
-      <w:pPr>
-        <w:pStyle w:val="Heading3"/>
-      </w:pPr>
-      <w:r>
-        <w:t xml:space="preserve">Team Moat Sync</w:t>
-      </w:r>
-    </w:p>
-    <w:p>
-      <w:pPr>
-        <w:pStyle w:val="ListParagraph"/>
-        <w:numPr>
-          <w:ilvl w:val="0"/>
-          <w:numId w:val="3"/>
-        </w:numPr>
-        <w:spacing w:after="80"/>
-      </w:pPr>
-      <w:r>
-        <w:t xml:space="preserve">Cloud Sync: merges your local data with Supabase team bundle (deals, comps, audit, outreach).</w:t>
-      </w:r>
-    </w:p>
-    <w:p>
-      <w:pPr>
-        <w:pStyle w:val="ListParagraph"/>
-        <w:numPr>
-          <w:ilvl w:val="0"/>
-          <w:numId w:val="3"/>
-        </w:numPr>
-        <w:spacing w:after="80"/>
-      </w:pPr>
-      <w:r>
-        <w:t xml:space="preserve">Export Bundle: download JSON to share offline.</w:t>
-      </w:r>
-    </w:p>
-    <w:p>
-      <w:pPr>
-        <w:pStyle w:val="ListParagraph"/>
-        <w:numPr>
-          <w:ilvl w:val="0"/>
-          <w:numId w:val="3"/>
-        </w:numPr>
-        <w:spacing w:after="80"/>
-      </w:pPr>
-      <w:r>
-        <w:t xml:space="preserve">Import Bundle: upload a teammate's JSON file.</w:t>
-      </w:r>
-    </w:p>
-    <w:p>
-      <w:pPr>
-        <w:spacing w:after="120"/>
-      </w:pPr>
-      <w:r>
-        <w:t xml:space="preserve">Status bar shows Supabase connection and last sync time.</w:t>
+        <w:t xml:space="preserve">Intake counties include Williamson, Travis, Bastrop, Caldwell, Hays, Comal, Bexar, Guadalupe, Fort Bend, Smith (Tyler), and more.</w:t>
+      </w:r>
+    </w:p>
+    <w:p>
+      <w:pPr>
+        <w:pStyle w:val="ListParagraph"/>
+        <w:numPr>
+          <w:ilvl w:val="0"/>
+          <w:numId w:val="3"/>
+        </w:numPr>
+        <w:spacing w:after="80"/>
+      </w:pPr>
+      <w:r>
+        <w:t xml:space="preserve">County GIS / ArcGIS for parcel attributes</w:t>
+      </w:r>
+    </w:p>
+    <w:p>
+      <w:pPr>
+        <w:pStyle w:val="ListParagraph"/>
+        <w:numPr>
+          <w:ilvl w:val="0"/>
+          <w:numId w:val="3"/>
+        </w:numPr>
+        <w:spacing w:after="80"/>
+      </w:pPr>
+      <w:r>
+        <w:t xml:space="preserve">FEMA NFHL for flood zones</w:t>
+      </w:r>
+    </w:p>
+    <w:p>
+      <w:pPr>
+        <w:pStyle w:val="ListParagraph"/>
+        <w:numPr>
+          <w:ilvl w:val="0"/>
+          <w:numId w:val="3"/>
+        </w:numPr>
+        <w:spacing w:after="80"/>
+      </w:pPr>
+      <w:r>
+        <w:t xml:space="preserve">Texas PUC for water/sewer CCN boundaries</w:t>
+      </w:r>
+    </w:p>
+    <w:p>
+      <w:pPr>
+        <w:pStyle w:val="ListParagraph"/>
+        <w:numPr>
+          <w:ilvl w:val="0"/>
+          <w:numId w:val="3"/>
+        </w:numPr>
+        <w:spacing w:after="80"/>
+      </w:pPr>
+      <w:r>
+        <w:t xml:space="preserve">id.land for parcel detail and comps (with token)</w:t>
+      </w:r>
+    </w:p>
+    <w:p>
+      <w:pPr>
+        <w:pStyle w:val="ListParagraph"/>
+        <w:numPr>
+          <w:ilvl w:val="0"/>
+          <w:numId w:val="3"/>
+        </w:numPr>
+        <w:spacing w:after="80"/>
+      </w:pPr>
+      <w:r>
+        <w:t xml:space="preserve">Forewarn for owner contact (production key required)</w:t>
+      </w:r>
+    </w:p>
+    <w:p>
+      <w:pPr>
+        <w:pStyle w:val="ListParagraph"/>
+        <w:numPr>
+          <w:ilvl w:val="0"/>
+          <w:numId w:val="3"/>
+        </w:numPr>
+        <w:spacing w:after="80"/>
+      </w:pPr>
+      <w:r>
+        <w:t xml:space="preserve">DNCScrub for federal DNC registry (cold texts only)</w:t>
       </w:r>
     </w:p>
     <w:p>
@@ -1259,83 +2513,7 @@
         <w:pStyle w:val="Heading1"/>
       </w:pPr>
       <w:r>
-        <w:t xml:space="preserve">6. Working With Your Team</w:t>
-      </w:r>
-    </w:p>
-    <w:p>
-      <w:pPr>
-        <w:pStyle w:val="ListParagraph"/>
-        <w:numPr>
-          <w:ilvl w:val="0"/>
-          <w:numId w:val="3"/>
-        </w:numPr>
-        <w:spacing w:after="80"/>
-      </w:pPr>
-      <w:r>
-        <w:t xml:space="preserve">Copy App Link in the header — send to Jack or any partner.</w:t>
-      </w:r>
-    </w:p>
-    <w:p>
-      <w:pPr>
-        <w:pStyle w:val="ListParagraph"/>
-        <w:numPr>
-          <w:ilvl w:val="0"/>
-          <w:numId w:val="3"/>
-        </w:numPr>
-        <w:spacing w:after="80"/>
-      </w:pPr>
-      <w:r>
-        <w:t xml:space="preserve">Each person uses their own browser; Cloud Sync merges on Intel tab.</w:t>
-      </w:r>
-    </w:p>
-    <w:p>
-      <w:pPr>
-        <w:pStyle w:val="ListParagraph"/>
-        <w:numPr>
-          <w:ilvl w:val="0"/>
-          <w:numId w:val="3"/>
-        </w:numPr>
-        <w:spacing w:after="80"/>
-      </w:pPr>
-      <w:r>
-        <w:t xml:space="preserve">Feature Request button: submit ideas (routes to jeremy@cto.com).</w:t>
-      </w:r>
-    </w:p>
-    <w:p>
-      <w:pPr>
-        <w:pStyle w:val="ListParagraph"/>
-        <w:numPr>
-          <w:ilvl w:val="0"/>
-          <w:numId w:val="3"/>
-        </w:numPr>
-        <w:spacing w:after="80"/>
-      </w:pPr>
-      <w:r>
-        <w:t xml:space="preserve">No software install — works on phone and desktop.</w:t>
-      </w:r>
-    </w:p>
-    <w:p>
-      <w:pPr>
-        <w:pStyle w:val="Heading1"/>
-      </w:pPr>
-      <w:r>
-        <w:t xml:space="preserve">7. Counties Supported</w:t>
-      </w:r>
-    </w:p>
-    <w:p>
-      <w:pPr>
-        <w:spacing w:after="120"/>
-      </w:pPr>
-      <w:r>
-        <w:t xml:space="preserve">Intake dropdown: Williamson, Travis, Bastrop, Caldwell, Hays, Comal, Bexar, Guadalupe, Fort Bend, Smith (Tyler). Seed deals included for Bastrop, Caldwell, Comal, Bexar.</w:t>
-      </w:r>
-    </w:p>
-    <w:p>
-      <w:pPr>
-        <w:pStyle w:val="Heading1"/>
-      </w:pPr>
-      <w:r>
-        <w:t xml:space="preserve">8. Tips &amp; Troubleshooting</w:t>
+        <w:t xml:space="preserve">9. Admin &amp; Setup (for operators)</w:t>
       </w:r>
     </w:p>
     <w:tbl>
@@ -1378,7 +2556,7 @@
                 <w:b/>
                 <w:bCs/>
               </w:rPr>
-              <w:t xml:space="preserve">Issue</w:t>
+              <w:t xml:space="preserve">Task</w:t>
             </w:r>
           </w:p>
         </w:tc>
@@ -1405,7 +2583,7 @@
                 <w:b/>
                 <w:bCs/>
               </w:rPr>
-              <w:t xml:space="preserve">Fix</w:t>
+              <w:t xml:space="preserve">How</w:t>
             </w:r>
           </w:p>
         </w:tc>
@@ -1434,7 +2612,7 @@
                 <w:b w:val="false"/>
                 <w:bCs w:val="false"/>
               </w:rPr>
-              <w:t xml:space="preserve">Cloud Sync says not configured</w:t>
+              <w:t xml:space="preserve">Deploy</w:t>
             </w:r>
           </w:p>
         </w:tc>
@@ -1461,7 +2639,7 @@
                 <w:b w:val="false"/>
                 <w:bCs w:val="false"/>
               </w:rPr>
-              <w:t xml:space="preserve">Deploy must be on Vercel with Supabase env vars. Use Export/Import Bundle offline.</w:t>
+              <w:t xml:space="preserve">Git push to main → Vercel auto-deploys to barntobank.com</w:t>
             </w:r>
           </w:p>
         </w:tc>
@@ -1490,7 +2668,7 @@
                 <w:b w:val="false"/>
                 <w:bCs w:val="false"/>
               </w:rPr>
-              <w:t xml:space="preserve">Enrichment shows MOCK</w:t>
+              <w:t xml:space="preserve">Set staff password</w:t>
             </w:r>
           </w:p>
         </w:tc>
@@ -1517,7 +2695,7 @@
                 <w:b w:val="false"/>
                 <w:bCs w:val="false"/>
               </w:rPr>
-              <w:t xml:space="preserve">Connect id.land token or county may lack public CAD REST — mock profile fills gaps.</w:t>
+              <w:t xml:space="preserve">Vercel env: ORIGINATION_PASSWORD</w:t>
             </w:r>
           </w:p>
         </w:tc>
@@ -1546,7 +2724,7 @@
                 <w:b w:val="false"/>
                 <w:bCs w:val="false"/>
               </w:rPr>
-              <w:t xml:space="preserve">Deal excluded from outreach</w:t>
+              <w:t xml:space="preserve">Enable cloud sync</w:t>
             </w:r>
           </w:p>
         </w:tc>
@@ -1573,7 +2751,7 @@
                 <w:b w:val="false"/>
                 <w:bCs w:val="false"/>
               </w:rPr>
-              <w:t xml:space="preserve">Entitlement bottleneck (no sewer) or missing owner contact.</w:t>
+              <w:t xml:space="preserve">Vercel env: SUPABASE_URL, SUPABASE_SERVICE_ROLE_KEY, MOAT_TEAM_ID</w:t>
             </w:r>
           </w:p>
         </w:tc>
@@ -1602,7 +2780,7 @@
                 <w:b w:val="false"/>
                 <w:bCs w:val="false"/>
               </w:rPr>
-              <w:t xml:space="preserve">Text blocked</w:t>
+              <w:t xml:space="preserve">Enable live DNC scrub</w:t>
             </w:r>
           </w:p>
         </w:tc>
@@ -1629,7 +2807,7 @@
                 <w:b w:val="false"/>
                 <w:bCs w:val="false"/>
               </w:rPr>
-              <w:t xml:space="preserve">Number failed DNC scrub — do not contact. Use direct mail instead.</w:t>
+              <w:t xml:space="preserve">Vercel env: DNC_SCRUB_API_KEY — run npm run provision-dncscrub-mcp</w:t>
             </w:r>
           </w:p>
         </w:tc>
@@ -1658,7 +2836,7 @@
                 <w:b w:val="false"/>
                 <w:bCs w:val="false"/>
               </w:rPr>
-              <w:t xml:space="preserve">Intel tab empty on phone</w:t>
+              <w:t xml:space="preserve">Provision Supabase</w:t>
             </w:r>
           </w:p>
         </w:tc>
@@ -1685,7 +2863,88 @@
                 <w:b w:val="false"/>
                 <w:bCs w:val="false"/>
               </w:rPr>
-              <w:t xml:space="preserve">Tap Intel in section nav — moat section is panel-only on mobile.</w:t>
+              <w:t xml:space="preserve">npm run provision-supabase-mcp</w:t>
+            </w:r>
+          </w:p>
+        </w:tc>
+      </w:tr>
+    </w:tbl>
+    <w:p>
+      <w:pPr>
+        <w:pStyle w:val="Heading1"/>
+      </w:pPr>
+      <w:r>
+        <w:t xml:space="preserve">10. Tips &amp; Troubleshooting</w:t>
+      </w:r>
+    </w:p>
+    <w:tbl>
+      <w:tblPr>
+        <w:tblW w:type="dxa" w:w="9360"/>
+        <w:tblBorders>
+          <w:top w:val="single" w:color="auto" w:sz="4"/>
+          <w:left w:val="single" w:color="auto" w:sz="4"/>
+          <w:bottom w:val="single" w:color="auto" w:sz="4"/>
+          <w:right w:val="single" w:color="auto" w:sz="4"/>
+          <w:insideH w:val="single" w:color="auto" w:sz="4"/>
+          <w:insideV w:val="single" w:color="auto" w:sz="4"/>
+        </w:tblBorders>
+      </w:tblPr>
+      <w:tblGrid>
+        <w:gridCol w:w="2800"/>
+        <w:gridCol w:w="6560"/>
+      </w:tblGrid>
+      <w:tr>
+        <w:tc>
+          <w:tcPr>
+            <w:tcW w:type="dxa" w:w="2800"/>
+            <w:tcBorders>
+              <w:top w:val="single" w:color="CCCCCC" w:sz="1"/>
+              <w:left w:val="single" w:color="CCCCCC" w:sz="1"/>
+              <w:bottom w:val="single" w:color="CCCCCC" w:sz="1"/>
+              <w:right w:val="single" w:color="CCCCCC" w:sz="1"/>
+            </w:tcBorders>
+            <w:shd w:fill="E8E0D0" w:val="clear"/>
+            <w:tcMar>
+              <w:top w:type="dxa" w:w="80"/>
+              <w:left w:type="dxa" w:w="120"/>
+              <w:bottom w:type="dxa" w:w="80"/>
+              <w:right w:type="dxa" w:w="120"/>
+            </w:tcMar>
+          </w:tcPr>
+          <w:p>
+            <w:r>
+              <w:rPr>
+                <w:b/>
+                <w:bCs/>
+              </w:rPr>
+              <w:t xml:space="preserve">Issue</w:t>
+            </w:r>
+          </w:p>
+        </w:tc>
+        <w:tc>
+          <w:tcPr>
+            <w:tcW w:type="dxa" w:w="6560"/>
+            <w:tcBorders>
+              <w:top w:val="single" w:color="CCCCCC" w:sz="1"/>
+              <w:left w:val="single" w:color="CCCCCC" w:sz="1"/>
+              <w:bottom w:val="single" w:color="CCCCCC" w:sz="1"/>
+              <w:right w:val="single" w:color="CCCCCC" w:sz="1"/>
+            </w:tcBorders>
+            <w:shd w:fill="E8E0D0" w:val="clear"/>
+            <w:tcMar>
+              <w:top w:type="dxa" w:w="80"/>
+              <w:left w:type="dxa" w:w="120"/>
+              <w:bottom w:type="dxa" w:w="80"/>
+              <w:right w:type="dxa" w:w="120"/>
+            </w:tcMar>
+          </w:tcPr>
+          <w:p>
+            <w:r>
+              <w:rPr>
+                <w:b/>
+                <w:bCs/>
+              </w:rPr>
+              <w:t xml:space="preserve">Fix</w:t>
             </w:r>
           </w:p>
         </w:tc>
@@ -1714,7 +2973,7 @@
                 <w:b w:val="false"/>
                 <w:bCs w:val="false"/>
               </w:rPr>
-              <w:t xml:space="preserve">Hard refresh</w:t>
+              <w:t xml:space="preserve">Redirected to login</w:t>
             </w:r>
           </w:p>
         </w:tc>
@@ -1741,7 +3000,455 @@
                 <w:b w:val="false"/>
                 <w:bCs w:val="false"/>
               </w:rPr>
-              <w:t xml:space="preserve">Cmd+Shift+R (Mac) or Ctrl+Shift+R (Windows) after updates.</w:t>
+              <w:t xml:space="preserve">Session expired — sign in again at /app/login</w:t>
+            </w:r>
+          </w:p>
+        </w:tc>
+      </w:tr>
+      <w:tr>
+        <w:tc>
+          <w:tcPr>
+            <w:tcW w:type="dxa" w:w="2800"/>
+            <w:tcBorders>
+              <w:top w:val="single" w:color="CCCCCC" w:sz="1"/>
+              <w:left w:val="single" w:color="CCCCCC" w:sz="1"/>
+              <w:bottom w:val="single" w:color="CCCCCC" w:sz="1"/>
+              <w:right w:val="single" w:color="CCCCCC" w:sz="1"/>
+            </w:tcBorders>
+            <w:shd w:fill="FFFFFF" w:val="clear"/>
+            <w:tcMar>
+              <w:top w:type="dxa" w:w="80"/>
+              <w:left w:type="dxa" w:w="120"/>
+              <w:bottom w:type="dxa" w:w="80"/>
+              <w:right w:type="dxa" w:w="120"/>
+            </w:tcMar>
+          </w:tcPr>
+          <w:p>
+            <w:r>
+              <w:rPr>
+                <w:b w:val="false"/>
+                <w:bCs w:val="false"/>
+              </w:rPr>
+              <w:t xml:space="preserve">Cloud Sync not configured</w:t>
+            </w:r>
+          </w:p>
+        </w:tc>
+        <w:tc>
+          <w:tcPr>
+            <w:tcW w:type="dxa" w:w="6560"/>
+            <w:tcBorders>
+              <w:top w:val="single" w:color="CCCCCC" w:sz="1"/>
+              <w:left w:val="single" w:color="CCCCCC" w:sz="1"/>
+              <w:bottom w:val="single" w:color="CCCCCC" w:sz="1"/>
+              <w:right w:val="single" w:color="CCCCCC" w:sz="1"/>
+            </w:tcBorders>
+            <w:shd w:fill="FFFFFF" w:val="clear"/>
+            <w:tcMar>
+              <w:top w:type="dxa" w:w="80"/>
+              <w:left w:type="dxa" w:w="120"/>
+              <w:bottom w:type="dxa" w:w="80"/>
+              <w:right w:type="dxa" w:w="120"/>
+            </w:tcMar>
+          </w:tcPr>
+          <w:p>
+            <w:r>
+              <w:rPr>
+                <w:b w:val="false"/>
+                <w:bCs w:val="false"/>
+              </w:rPr>
+              <w:t xml:space="preserve">Supabase env vars missing on Vercel — use Export/Import Bundle offline</w:t>
+            </w:r>
+          </w:p>
+        </w:tc>
+      </w:tr>
+      <w:tr>
+        <w:tc>
+          <w:tcPr>
+            <w:tcW w:type="dxa" w:w="2800"/>
+            <w:tcBorders>
+              <w:top w:val="single" w:color="CCCCCC" w:sz="1"/>
+              <w:left w:val="single" w:color="CCCCCC" w:sz="1"/>
+              <w:bottom w:val="single" w:color="CCCCCC" w:sz="1"/>
+              <w:right w:val="single" w:color="CCCCCC" w:sz="1"/>
+            </w:tcBorders>
+            <w:shd w:fill="FFFFFF" w:val="clear"/>
+            <w:tcMar>
+              <w:top w:type="dxa" w:w="80"/>
+              <w:left w:type="dxa" w:w="120"/>
+              <w:bottom w:type="dxa" w:w="80"/>
+              <w:right w:type="dxa" w:w="120"/>
+            </w:tcMar>
+          </w:tcPr>
+          <w:p>
+            <w:r>
+              <w:rPr>
+                <w:b w:val="false"/>
+                <w:bCs w:val="false"/>
+              </w:rPr>
+              <w:t xml:space="preserve">Enrichment shows MOCK</w:t>
+            </w:r>
+          </w:p>
+        </w:tc>
+        <w:tc>
+          <w:tcPr>
+            <w:tcW w:type="dxa" w:w="6560"/>
+            <w:tcBorders>
+              <w:top w:val="single" w:color="CCCCCC" w:sz="1"/>
+              <w:left w:val="single" w:color="CCCCCC" w:sz="1"/>
+              <w:bottom w:val="single" w:color="CCCCCC" w:sz="1"/>
+              <w:right w:val="single" w:color="CCCCCC" w:sz="1"/>
+            </w:tcBorders>
+            <w:shd w:fill="FFFFFF" w:val="clear"/>
+            <w:tcMar>
+              <w:top w:type="dxa" w:w="80"/>
+              <w:left w:type="dxa" w:w="120"/>
+              <w:bottom w:type="dxa" w:w="80"/>
+              <w:right w:type="dxa" w:w="120"/>
+            </w:tcMar>
+          </w:tcPr>
+          <w:p>
+            <w:r>
+              <w:rPr>
+                <w:b w:val="false"/>
+                <w:bCs w:val="false"/>
+              </w:rPr>
+              <w:t xml:space="preserve">Connect id.land token; some counties use mock profile until CAD REST is wired</w:t>
+            </w:r>
+          </w:p>
+        </w:tc>
+      </w:tr>
+      <w:tr>
+        <w:tc>
+          <w:tcPr>
+            <w:tcW w:type="dxa" w:w="2800"/>
+            <w:tcBorders>
+              <w:top w:val="single" w:color="CCCCCC" w:sz="1"/>
+              <w:left w:val="single" w:color="CCCCCC" w:sz="1"/>
+              <w:bottom w:val="single" w:color="CCCCCC" w:sz="1"/>
+              <w:right w:val="single" w:color="CCCCCC" w:sz="1"/>
+            </w:tcBorders>
+            <w:shd w:fill="FFFFFF" w:val="clear"/>
+            <w:tcMar>
+              <w:top w:type="dxa" w:w="80"/>
+              <w:left w:type="dxa" w:w="120"/>
+              <w:bottom w:type="dxa" w:w="80"/>
+              <w:right w:type="dxa" w:w="120"/>
+            </w:tcMar>
+          </w:tcPr>
+          <w:p>
+            <w:r>
+              <w:rPr>
+                <w:b w:val="false"/>
+                <w:bCs w:val="false"/>
+              </w:rPr>
+              <w:t xml:space="preserve">Deal excluded from outreach</w:t>
+            </w:r>
+          </w:p>
+        </w:tc>
+        <w:tc>
+          <w:tcPr>
+            <w:tcW w:type="dxa" w:w="6560"/>
+            <w:tcBorders>
+              <w:top w:val="single" w:color="CCCCCC" w:sz="1"/>
+              <w:left w:val="single" w:color="CCCCCC" w:sz="1"/>
+              <w:bottom w:val="single" w:color="CCCCCC" w:sz="1"/>
+              <w:right w:val="single" w:color="CCCCCC" w:sz="1"/>
+            </w:tcBorders>
+            <w:shd w:fill="FFFFFF" w:val="clear"/>
+            <w:tcMar>
+              <w:top w:type="dxa" w:w="80"/>
+              <w:left w:type="dxa" w:w="120"/>
+              <w:bottom w:type="dxa" w:w="80"/>
+              <w:right w:type="dxa" w:w="120"/>
+            </w:tcMar>
+          </w:tcPr>
+          <w:p>
+            <w:r>
+              <w:rPr>
+                <w:b w:val="false"/>
+                <w:bCs w:val="false"/>
+              </w:rPr>
+              <w:t xml:space="preserve">Entitlement bottleneck or missing owner contact</w:t>
+            </w:r>
+          </w:p>
+        </w:tc>
+      </w:tr>
+      <w:tr>
+        <w:tc>
+          <w:tcPr>
+            <w:tcW w:type="dxa" w:w="2800"/>
+            <w:tcBorders>
+              <w:top w:val="single" w:color="CCCCCC" w:sz="1"/>
+              <w:left w:val="single" w:color="CCCCCC" w:sz="1"/>
+              <w:bottom w:val="single" w:color="CCCCCC" w:sz="1"/>
+              <w:right w:val="single" w:color="CCCCCC" w:sz="1"/>
+            </w:tcBorders>
+            <w:shd w:fill="FFFFFF" w:val="clear"/>
+            <w:tcMar>
+              <w:top w:type="dxa" w:w="80"/>
+              <w:left w:type="dxa" w:w="120"/>
+              <w:bottom w:type="dxa" w:w="80"/>
+              <w:right w:type="dxa" w:w="120"/>
+            </w:tcMar>
+          </w:tcPr>
+          <w:p>
+            <w:r>
+              <w:rPr>
+                <w:b w:val="false"/>
+                <w:bCs w:val="false"/>
+              </w:rPr>
+              <w:t xml:space="preserve">DNC scrub failed</w:t>
+            </w:r>
+          </w:p>
+        </w:tc>
+        <w:tc>
+          <w:tcPr>
+            <w:tcW w:type="dxa" w:w="6560"/>
+            <w:tcBorders>
+              <w:top w:val="single" w:color="CCCCCC" w:sz="1"/>
+              <w:left w:val="single" w:color="CCCCCC" w:sz="1"/>
+              <w:bottom w:val="single" w:color="CCCCCC" w:sz="1"/>
+              <w:right w:val="single" w:color="CCCCCC" w:sz="1"/>
+            </w:tcBorders>
+            <w:shd w:fill="FFFFFF" w:val="clear"/>
+            <w:tcMar>
+              <w:top w:type="dxa" w:w="80"/>
+              <w:left w:type="dxa" w:w="120"/>
+              <w:bottom w:type="dxa" w:w="80"/>
+              <w:right w:type="dxa" w:w="120"/>
+            </w:tcMar>
+          </w:tcPr>
+          <w:p>
+            <w:r>
+              <w:rPr>
+                <w:b w:val="false"/>
+                <w:bCs w:val="false"/>
+              </w:rPr>
+              <w:t xml:space="preserve">Set DNC_SCRUB_API_KEY or use direct mail instead</w:t>
+            </w:r>
+          </w:p>
+        </w:tc>
+      </w:tr>
+      <w:tr>
+        <w:tc>
+          <w:tcPr>
+            <w:tcW w:type="dxa" w:w="2800"/>
+            <w:tcBorders>
+              <w:top w:val="single" w:color="CCCCCC" w:sz="1"/>
+              <w:left w:val="single" w:color="CCCCCC" w:sz="1"/>
+              <w:bottom w:val="single" w:color="CCCCCC" w:sz="1"/>
+              <w:right w:val="single" w:color="CCCCCC" w:sz="1"/>
+            </w:tcBorders>
+            <w:shd w:fill="FFFFFF" w:val="clear"/>
+            <w:tcMar>
+              <w:top w:type="dxa" w:w="80"/>
+              <w:left w:type="dxa" w:w="120"/>
+              <w:bottom w:type="dxa" w:w="80"/>
+              <w:right w:type="dxa" w:w="120"/>
+            </w:tcMar>
+          </w:tcPr>
+          <w:p>
+            <w:r>
+              <w:rPr>
+                <w:b w:val="false"/>
+                <w:bCs w:val="false"/>
+              </w:rPr>
+              <w:t xml:space="preserve">Text blocked after scrub</w:t>
+            </w:r>
+          </w:p>
+        </w:tc>
+        <w:tc>
+          <w:tcPr>
+            <w:tcW w:type="dxa" w:w="6560"/>
+            <w:tcBorders>
+              <w:top w:val="single" w:color="CCCCCC" w:sz="1"/>
+              <w:left w:val="single" w:color="CCCCCC" w:sz="1"/>
+              <w:bottom w:val="single" w:color="CCCCCC" w:sz="1"/>
+              <w:right w:val="single" w:color="CCCCCC" w:sz="1"/>
+            </w:tcBorders>
+            <w:shd w:fill="FFFFFF" w:val="clear"/>
+            <w:tcMar>
+              <w:top w:type="dxa" w:w="80"/>
+              <w:left w:type="dxa" w:w="120"/>
+              <w:bottom w:type="dxa" w:w="80"/>
+              <w:right w:type="dxa" w:w="120"/>
+            </w:tcMar>
+          </w:tcPr>
+          <w:p>
+            <w:r>
+              <w:rPr>
+                <w:b w:val="false"/>
+                <w:bCs w:val="false"/>
+              </w:rPr>
+              <w:t xml:space="preserve">Number on DNC list — use mail, do not text</w:t>
+            </w:r>
+          </w:p>
+        </w:tc>
+      </w:tr>
+      <w:tr>
+        <w:tc>
+          <w:tcPr>
+            <w:tcW w:type="dxa" w:w="2800"/>
+            <w:tcBorders>
+              <w:top w:val="single" w:color="CCCCCC" w:sz="1"/>
+              <w:left w:val="single" w:color="CCCCCC" w:sz="1"/>
+              <w:bottom w:val="single" w:color="CCCCCC" w:sz="1"/>
+              <w:right w:val="single" w:color="CCCCCC" w:sz="1"/>
+            </w:tcBorders>
+            <w:shd w:fill="FFFFFF" w:val="clear"/>
+            <w:tcMar>
+              <w:top w:type="dxa" w:w="80"/>
+              <w:left w:type="dxa" w:w="120"/>
+              <w:bottom w:type="dxa" w:w="80"/>
+              <w:right w:type="dxa" w:w="120"/>
+            </w:tcMar>
+          </w:tcPr>
+          <w:p>
+            <w:r>
+              <w:rPr>
+                <w:b w:val="false"/>
+                <w:bCs w:val="false"/>
+              </w:rPr>
+              <w:t xml:space="preserve">Website lead not showing</w:t>
+            </w:r>
+          </w:p>
+        </w:tc>
+        <w:tc>
+          <w:tcPr>
+            <w:tcW w:type="dxa" w:w="6560"/>
+            <w:tcBorders>
+              <w:top w:val="single" w:color="CCCCCC" w:sz="1"/>
+              <w:left w:val="single" w:color="CCCCCC" w:sz="1"/>
+              <w:bottom w:val="single" w:color="CCCCCC" w:sz="1"/>
+              <w:right w:val="single" w:color="CCCCCC" w:sz="1"/>
+            </w:tcBorders>
+            <w:shd w:fill="FFFFFF" w:val="clear"/>
+            <w:tcMar>
+              <w:top w:type="dxa" w:w="80"/>
+              <w:left w:type="dxa" w:w="120"/>
+              <w:bottom w:type="dxa" w:w="80"/>
+              <w:right w:type="dxa" w:w="120"/>
+            </w:tcMar>
+          </w:tcPr>
+          <w:p>
+            <w:r>
+              <w:rPr>
+                <w:b w:val="false"/>
+                <w:bCs w:val="false"/>
+              </w:rPr>
+              <w:t xml:space="preserve">Click Website Leads Refresh on Intake or Intel</w:t>
+            </w:r>
+          </w:p>
+        </w:tc>
+      </w:tr>
+      <w:tr>
+        <w:tc>
+          <w:tcPr>
+            <w:tcW w:type="dxa" w:w="2800"/>
+            <w:tcBorders>
+              <w:top w:val="single" w:color="CCCCCC" w:sz="1"/>
+              <w:left w:val="single" w:color="CCCCCC" w:sz="1"/>
+              <w:bottom w:val="single" w:color="CCCCCC" w:sz="1"/>
+              <w:right w:val="single" w:color="CCCCCC" w:sz="1"/>
+            </w:tcBorders>
+            <w:shd w:fill="FFFFFF" w:val="clear"/>
+            <w:tcMar>
+              <w:top w:type="dxa" w:w="80"/>
+              <w:left w:type="dxa" w:w="120"/>
+              <w:bottom w:type="dxa" w:w="80"/>
+              <w:right w:type="dxa" w:w="120"/>
+            </w:tcMar>
+          </w:tcPr>
+          <w:p>
+            <w:r>
+              <w:rPr>
+                <w:b w:val="false"/>
+                <w:bCs w:val="false"/>
+              </w:rPr>
+              <w:t xml:space="preserve">Stale UI after update</w:t>
+            </w:r>
+          </w:p>
+        </w:tc>
+        <w:tc>
+          <w:tcPr>
+            <w:tcW w:type="dxa" w:w="6560"/>
+            <w:tcBorders>
+              <w:top w:val="single" w:color="CCCCCC" w:sz="1"/>
+              <w:left w:val="single" w:color="CCCCCC" w:sz="1"/>
+              <w:bottom w:val="single" w:color="CCCCCC" w:sz="1"/>
+              <w:right w:val="single" w:color="CCCCCC" w:sz="1"/>
+            </w:tcBorders>
+            <w:shd w:fill="FFFFFF" w:val="clear"/>
+            <w:tcMar>
+              <w:top w:type="dxa" w:w="80"/>
+              <w:left w:type="dxa" w:w="120"/>
+              <w:bottom w:type="dxa" w:w="80"/>
+              <w:right w:type="dxa" w:w="120"/>
+            </w:tcMar>
+          </w:tcPr>
+          <w:p>
+            <w:r>
+              <w:rPr>
+                <w:b w:val="false"/>
+                <w:bCs w:val="false"/>
+              </w:rPr>
+              <w:t xml:space="preserve">Hard refresh: Cmd+Shift+R (Mac) or Ctrl+Shift+R (Windows)</w:t>
+            </w:r>
+          </w:p>
+        </w:tc>
+      </w:tr>
+      <w:tr>
+        <w:tc>
+          <w:tcPr>
+            <w:tcW w:type="dxa" w:w="2800"/>
+            <w:tcBorders>
+              <w:top w:val="single" w:color="CCCCCC" w:sz="1"/>
+              <w:left w:val="single" w:color="CCCCCC" w:sz="1"/>
+              <w:bottom w:val="single" w:color="CCCCCC" w:sz="1"/>
+              <w:right w:val="single" w:color="CCCCCC" w:sz="1"/>
+            </w:tcBorders>
+            <w:shd w:fill="FFFFFF" w:val="clear"/>
+            <w:tcMar>
+              <w:top w:type="dxa" w:w="80"/>
+              <w:left w:type="dxa" w:w="120"/>
+              <w:bottom w:type="dxa" w:w="80"/>
+              <w:right w:type="dxa" w:w="120"/>
+            </w:tcMar>
+          </w:tcPr>
+          <w:p>
+            <w:r>
+              <w:rPr>
+                <w:b w:val="false"/>
+                <w:bCs w:val="false"/>
+              </w:rPr>
+              <w:t xml:space="preserve">www vs apex domain</w:t>
+            </w:r>
+          </w:p>
+        </w:tc>
+        <w:tc>
+          <w:tcPr>
+            <w:tcW w:type="dxa" w:w="6560"/>
+            <w:tcBorders>
+              <w:top w:val="single" w:color="CCCCCC" w:sz="1"/>
+              <w:left w:val="single" w:color="CCCCCC" w:sz="1"/>
+              <w:bottom w:val="single" w:color="CCCCCC" w:sz="1"/>
+              <w:right w:val="single" w:color="CCCCCC" w:sz="1"/>
+            </w:tcBorders>
+            <w:shd w:fill="FFFFFF" w:val="clear"/>
+            <w:tcMar>
+              <w:top w:type="dxa" w:w="80"/>
+              <w:left w:type="dxa" w:w="120"/>
+              <w:bottom w:type="dxa" w:w="80"/>
+              <w:right w:type="dxa" w:w="120"/>
+            </w:tcMar>
+          </w:tcPr>
+          <w:p>
+            <w:r>
+              <w:rPr>
+                <w:b w:val="false"/>
+                <w:bCs w:val="false"/>
+              </w:rPr>
+              <w:t xml:space="preserve">Both barntobank.com and www.barntobank.com point to Vercel</w:t>
             </w:r>
           </w:p>
         </w:tc>
@@ -1752,7 +3459,93 @@
         <w:pStyle w:val="Heading1"/>
       </w:pPr>
       <w:r>
-        <w:t xml:space="preserve">9. Glossary</w:t>
+        <w:t xml:space="preserve">11. Daily Workflow Cheat Sheet</w:t>
+      </w:r>
+    </w:p>
+    <w:p>
+      <w:pPr>
+        <w:pStyle w:val="ListParagraph"/>
+        <w:numPr>
+          <w:ilvl w:val="0"/>
+          <w:numId w:val="2"/>
+        </w:numPr>
+        <w:spacing w:after="80"/>
+      </w:pPr>
+      <w:r>
+        <w:t xml:space="preserve">Morning: Intel → Cloud Sync. Review Website Leads.</w:t>
+      </w:r>
+    </w:p>
+    <w:p>
+      <w:pPr>
+        <w:pStyle w:val="ListParagraph"/>
+        <w:numPr>
+          <w:ilvl w:val="0"/>
+          <w:numId w:val="2"/>
+        </w:numPr>
+        <w:spacing w:after="80"/>
+      </w:pPr>
+      <w:r>
+        <w:t xml:space="preserve">Intake: run Automation 1 on new tracts or inbound inquiries.</w:t>
+      </w:r>
+    </w:p>
+    <w:p>
+      <w:pPr>
+        <w:pStyle w:val="ListParagraph"/>
+        <w:numPr>
+          <w:ilvl w:val="0"/>
+          <w:numId w:val="2"/>
+        </w:numPr>
+        <w:spacing w:after="80"/>
+      </w:pPr>
+      <w:r>
+        <w:t xml:space="preserve">Deals: route each tract Develop / Sell / Retail; open modal for margin check.</w:t>
+      </w:r>
+    </w:p>
+    <w:p>
+      <w:pPr>
+        <w:pStyle w:val="ListParagraph"/>
+        <w:numPr>
+          <w:ilvl w:val="0"/>
+          <w:numId w:val="2"/>
+        </w:numPr>
+        <w:spacing w:after="80"/>
+      </w:pPr>
+      <w:r>
+        <w:t xml:space="preserve">Log comps after every broker call or off-market sale (+ Log Comp).</w:t>
+      </w:r>
+    </w:p>
+    <w:p>
+      <w:pPr>
+        <w:pStyle w:val="ListParagraph"/>
+        <w:numPr>
+          <w:ilvl w:val="0"/>
+          <w:numId w:val="2"/>
+        </w:numPr>
+        <w:spacing w:after="80"/>
+      </w:pPr>
+      <w:r>
+        <w:t xml:space="preserve">Outreach: Build Mail List weekly; export CSV to mail house or print labels.</w:t>
+      </w:r>
+    </w:p>
+    <w:p>
+      <w:pPr>
+        <w:pStyle w:val="ListParagraph"/>
+        <w:numPr>
+          <w:ilvl w:val="0"/>
+          <w:numId w:val="2"/>
+        </w:numPr>
+        <w:spacing w:after="80"/>
+      </w:pPr>
+      <w:r>
+        <w:t xml:space="preserve">End of day: Cloud Sync again so Jack sees your pipeline.</w:t>
+      </w:r>
+    </w:p>
+    <w:p>
+      <w:pPr>
+        <w:pStyle w:val="Heading1"/>
+      </w:pPr>
+      <w:r>
+        <w:t xml:space="preserve">12. Glossary</w:t>
       </w:r>
     </w:p>
     <w:p>
@@ -1778,20 +3571,20 @@
         <w:spacing w:after="80"/>
       </w:pPr>
       <w:r>
-        <w:t xml:space="preserve">CCN: Certificate of Convenience and Necessity (Texas utility service area)</w:t>
-      </w:r>
-    </w:p>
-    <w:p>
-      <w:pPr>
-        <w:pStyle w:val="ListParagraph"/>
-        <w:numPr>
-          <w:ilvl w:val="0"/>
-          <w:numId w:val="3"/>
-        </w:numPr>
-        <w:spacing w:after="80"/>
-      </w:pPr>
-      <w:r>
-        <w:t xml:space="preserve">SFHA: Special Flood Hazard Area (FEMA)</w:t>
+        <w:t xml:space="preserve">CCN: Certificate of Convenience and Necessity (Texas utility franchise area)</w:t>
+      </w:r>
+    </w:p>
+    <w:p>
+      <w:pPr>
+        <w:pStyle w:val="ListParagraph"/>
+        <w:numPr>
+          <w:ilvl w:val="0"/>
+          <w:numId w:val="3"/>
+        </w:numPr>
+        <w:spacing w:after="80"/>
+      </w:pPr>
+      <w:r>
+        <w:t xml:space="preserve">SFHA: Special Flood Hazard Area on FEMA maps</w:t>
       </w:r>
     </w:p>
     <w:p>
@@ -1817,20 +3610,59 @@
         <w:spacing w:after="80"/>
       </w:pPr>
       <w:r>
-        <w:t xml:space="preserve">Comp band: asking price vs private comp average for the county</w:t>
-      </w:r>
-    </w:p>
-    <w:p>
-      <w:pPr>
-        <w:pStyle w:val="ListParagraph"/>
-        <w:numPr>
-          <w:ilvl w:val="0"/>
-          <w:numId w:val="3"/>
-        </w:numPr>
-        <w:spacing w:after="80"/>
-      </w:pPr>
-      <w:r>
-        <w:t xml:space="preserve">Moat bundle: JSON export of deals, comps, audit, and outreach state</w:t>
+        <w:t xml:space="preserve">Comp band: asking price vs your private comp average</w:t>
+      </w:r>
+    </w:p>
+    <w:p>
+      <w:pPr>
+        <w:pStyle w:val="ListParagraph"/>
+        <w:numPr>
+          <w:ilvl w:val="0"/>
+          <w:numId w:val="3"/>
+        </w:numPr>
+        <w:spacing w:after="80"/>
+      </w:pPr>
+      <w:r>
+        <w:t xml:space="preserve">Moat bundle: JSON export of deals, comps, audit, outreach state</w:t>
+      </w:r>
+    </w:p>
+    <w:p>
+      <w:pPr>
+        <w:pStyle w:val="ListParagraph"/>
+        <w:numPr>
+          <w:ilvl w:val="0"/>
+          <w:numId w:val="3"/>
+        </w:numPr>
+        <w:spacing w:after="80"/>
+      </w:pPr>
+      <w:r>
+        <w:t xml:space="preserve">TCPA: federal law governing calls/texts to cell phones</w:t>
+      </w:r>
+    </w:p>
+    <w:p>
+      <w:pPr>
+        <w:pStyle w:val="ListParagraph"/>
+        <w:numPr>
+          <w:ilvl w:val="0"/>
+          <w:numId w:val="3"/>
+        </w:numPr>
+        <w:spacing w:after="80"/>
+      </w:pPr>
+      <w:r>
+        <w:t xml:space="preserve">DNC: National Do Not Call Registry — applies to cold calls/texts, not mail</w:t>
+      </w:r>
+    </w:p>
+    <w:p>
+      <w:pPr>
+        <w:pStyle w:val="ListParagraph"/>
+        <w:numPr>
+          <w:ilvl w:val="0"/>
+          <w:numId w:val="3"/>
+        </w:numPr>
+        <w:spacing w:after="80"/>
+      </w:pPr>
+      <w:r>
+        <w:t xml:space="preserve">SAN: FTC Subscription Account Number — required for live federal DNC scrub vendors</w:t>
       </w:r>
     </w:p>
     <w:p>
@@ -1846,20 +3678,20 @@
         <w:spacing w:after="200"/>
       </w:pPr>
       <w:r>
-        <w:t xml:space="preserve">Open </w:t>
-      </w:r>
-      <w:hyperlink w:history="1" r:id="rIdla3ucd1tv8-bb9yohykla">
+        <w:t xml:space="preserve">Sign in at </w:t>
+      </w:r>
+      <w:hyperlink w:history="1" r:id="rIdsjauovt0w30fx9lj29enn">
         <w:r>
           <w:rPr>
             <w:rStyle w:val="Hyperlink"/>
             <w:color w:val="0563C1"/>
             <w:u w:val="single"/>
           </w:rPr>
-          <w:t xml:space="preserve">https://barn-to-bank.vercel.app</w:t>
+          <w:t xml:space="preserve">https://barntobank.com/app/login</w:t>
         </w:r>
       </w:hyperlink>
       <w:r>
-        <w:t xml:space="preserve"> and run your first tract.</w:t>
+        <w:t xml:space="preserve">, run your first tract, and build your first mail list.</w:t>
       </w:r>
     </w:p>
     <w:sectPr>

</xml_diff>

<commit_message>
Bring the How-To doc back in line with the app
The generated guide was written in June and predated the Trello board, silo
drag-and-drop, the renamed lanes, and the id.land session states. It told
readers to set a deal's route from "the dropdown on the card", described the
board as a phone-friendly cards view, and listed id.land as optional when
nothing works without it.

Updated the generator rather than the binary, then regenerated. The pitch
doc is rebuilt as a side effect of the same script; its content is unchanged.

Corrections verified against the app: lane names, Board view, drag-to-route,
the full 16-county Intake list, the current header buttons, and the "Blurred"
owner-name symptom that means the id.land session lapsed.

Co-Authored-By: Claude Opus 5 (1M context) <noreply@anthropic.com>
</commit_message>
<xml_diff>
--- a/docs/Barn-to-Bank-How-To.docx
+++ b/docs/Barn-to-Bank-How-To.docx
@@ -37,7 +37,7 @@
       <w:r>
         <w:t xml:space="preserve">Staff app: </w:t>
       </w:r>
-      <w:hyperlink w:history="1" r:id="rId0dghxq2x6di7qpbhozkp-">
+      <w:hyperlink w:history="1" r:id="rIdyyfkqxubqscltc6btbfom">
         <w:r>
           <w:rPr>
             <w:rStyle w:val="Hyperlink"/>
@@ -55,7 +55,7 @@
       <w:r>
         <w:t xml:space="preserve">Public site: </w:t>
       </w:r>
-      <w:hyperlink w:history="1" r:id="rIddqzskii22ek0yyd01qjvw">
+      <w:hyperlink w:history="1" r:id="rIdqqoj8y4w8u_usvl2zte7y">
         <w:r>
           <w:rPr>
             <w:rStyle w:val="Hyperlink"/>
@@ -442,6 +442,14 @@
     </w:p>
     <w:p>
       <w:pPr>
+        <w:spacing w:after="120"/>
+      </w:pPr>
+      <w:r>
+        <w:t xml:space="preserve">A short version of this guide also lives inside the app: press How to Use in the header at any time.</w:t>
+      </w:r>
+    </w:p>
+    <w:p>
+      <w:pPr>
         <w:pStyle w:val="ListParagraph"/>
         <w:numPr>
           <w:ilvl w:val="0"/>
@@ -476,7 +484,7 @@
         <w:spacing w:after="80"/>
       </w:pPr>
       <w:r>
-        <w:t xml:space="preserve">In Intake, choose a county and enter a property address or parcel/APN.</w:t>
+        <w:t xml:space="preserve">In Intake, open id.land Connection and sign in. Do this before anything else — without it, owner names come back as "Blurred".</w:t>
       </w:r>
     </w:p>
     <w:p>
@@ -489,6 +497,19 @@
         <w:spacing w:after="80"/>
       </w:pPr>
       <w:r>
+        <w:t xml:space="preserve">Still in Intake, choose a county and enter a property address or parcel/APN.</w:t>
+      </w:r>
+    </w:p>
+    <w:p>
+      <w:pPr>
+        <w:pStyle w:val="ListParagraph"/>
+        <w:numPr>
+          <w:ilvl w:val="0"/>
+          <w:numId w:val="2"/>
+        </w:numPr>
+        <w:spacing w:after="80"/>
+      </w:pPr>
+      <w:r>
         <w:t xml:space="preserve">Click Run Automation 1. Wait for jurisdiction, flood, utilities, comps, and owner contact to populate.</w:t>
       </w:r>
     </w:p>
@@ -515,7 +536,7 @@
         <w:spacing w:after="80"/>
       </w:pPr>
       <w:r>
-        <w:t xml:space="preserve">Open the Deals tab, click the new deal, review entitlement score and route (Develop / Sell / Retail).</w:t>
+        <w:t xml:space="preserve">Open the Deals tab, click the new deal, review entitlement score and route.</w:t>
       </w:r>
     </w:p>
     <w:p>
@@ -528,6 +549,19 @@
         <w:spacing w:after="80"/>
       </w:pPr>
       <w:r>
+        <w:t xml:space="preserve">Open the Silos tab and drag the card into the lane that fits the play.</w:t>
+      </w:r>
+    </w:p>
+    <w:p>
+      <w:pPr>
+        <w:pStyle w:val="ListParagraph"/>
+        <w:numPr>
+          <w:ilvl w:val="0"/>
+          <w:numId w:val="2"/>
+        </w:numPr>
+        <w:spacing w:after="80"/>
+      </w:pPr>
+      <w:r>
         <w:t xml:space="preserve">Go to Outreach → Build Mail List → print labels or export CSV (no DNC vendor needed).</w:t>
       </w:r>
     </w:p>
@@ -541,7 +575,7 @@
         <w:spacing w:after="80"/>
       </w:pPr>
       <w:r>
-        <w:t xml:space="preserve">Go to Intel → Cloud Sync to share pipeline with your team.</w:t>
+        <w:t xml:space="preserve">Press Sync Now in the header so the rest of the team sees your pipeline.</w:t>
       </w:r>
     </w:p>
     <w:p>
@@ -999,7 +1033,7 @@
         <w:spacing w:after="120"/>
       </w:pPr>
       <w:r>
-        <w:t xml:space="preserve">Header buttons: Copy App Link (share with team), Feature Request, Intel (jump to moat), Cloud Sync (immediate team sync), Theme, Sign Out.</w:t>
+        <w:t xml:space="preserve">Header buttons: Theme (light/dark), A− and A+ (text size), Sign Out, Copy App Link (share with the team), How to Use (the in-app version of this guide), Feature Request, Intel (jump to the moat panel), and Sync Now (force an immediate team sync).</w:t>
       </w:r>
     </w:p>
     <w:p>
@@ -1268,46 +1302,85 @@
         <w:pStyle w:val="Heading3"/>
       </w:pPr>
       <w:r>
-        <w:t xml:space="preserve">id.land connection (optional, recommended)</w:t>
-      </w:r>
-    </w:p>
-    <w:p>
-      <w:pPr>
-        <w:pStyle w:val="ListParagraph"/>
-        <w:numPr>
-          <w:ilvl w:val="0"/>
-          <w:numId w:val="3"/>
-        </w:numPr>
-        <w:spacing w:after="80"/>
-      </w:pPr>
-      <w:r>
-        <w:t xml:space="preserve">Enter id.land email/password or paste a Bearer token under Advanced.</w:t>
-      </w:r>
-    </w:p>
-    <w:p>
-      <w:pPr>
-        <w:pStyle w:val="ListParagraph"/>
-        <w:numPr>
-          <w:ilvl w:val="0"/>
-          <w:numId w:val="3"/>
-        </w:numPr>
-        <w:spacing w:after="80"/>
-      </w:pPr>
-      <w:r>
-        <w:t xml:space="preserve">Token stays in your browser only — never stored in the repo.</w:t>
-      </w:r>
-    </w:p>
-    <w:p>
-      <w:pPr>
-        <w:pStyle w:val="ListParagraph"/>
-        <w:numPr>
-          <w:ilvl w:val="0"/>
-          <w:numId w:val="3"/>
-        </w:numPr>
-        <w:spacing w:after="80"/>
-      </w:pPr>
-      <w:r>
-        <w:t xml:space="preserve">Live token upgrades parcel geometry, land use, and market comps from MOCK to LIVE.</w:t>
+        <w:t xml:space="preserve">id.land connection (do this first)</w:t>
+      </w:r>
+    </w:p>
+    <w:p>
+      <w:pPr>
+        <w:pStyle w:val="ListParagraph"/>
+        <w:numPr>
+          <w:ilvl w:val="0"/>
+          <w:numId w:val="3"/>
+        </w:numPr>
+        <w:spacing w:after="80"/>
+      </w:pPr>
+      <w:r>
+        <w:t xml:space="preserve">Enter your id.land email and password, or paste a Bearer token under Advanced.</w:t>
+      </w:r>
+    </w:p>
+    <w:p>
+      <w:pPr>
+        <w:pStyle w:val="ListParagraph"/>
+        <w:numPr>
+          <w:ilvl w:val="0"/>
+          <w:numId w:val="3"/>
+        </w:numPr>
+        <w:spacing w:after="80"/>
+      </w:pPr>
+      <w:r>
+        <w:t xml:space="preserve">Token stays in your browser only — never stored in the repo, and never synced in the team bundle.</w:t>
+      </w:r>
+    </w:p>
+    <w:p>
+      <w:pPr>
+        <w:pStyle w:val="ListParagraph"/>
+        <w:numPr>
+          <w:ilvl w:val="0"/>
+          <w:numId w:val="3"/>
+        </w:numPr>
+        <w:spacing w:after="80"/>
+      </w:pPr>
+      <w:r>
+        <w:t xml:space="preserve">A live token upgrades parcel geometry, land use, and market comps from MOCK to LIVE.</w:t>
+      </w:r>
+    </w:p>
+    <w:p>
+      <w:pPr>
+        <w:pStyle w:val="ListParagraph"/>
+        <w:numPr>
+          <w:ilvl w:val="0"/>
+          <w:numId w:val="3"/>
+        </w:numPr>
+        <w:spacing w:after="80"/>
+      </w:pPr>
+      <w:r>
+        <w:t xml:space="preserve">Sign-in is per browser: signing in on your laptop does not sign you in on your phone or iPad.</w:t>
+      </w:r>
+    </w:p>
+    <w:p>
+      <w:pPr>
+        <w:pStyle w:val="ListParagraph"/>
+        <w:numPr>
+          <w:ilvl w:val="0"/>
+          <w:numId w:val="3"/>
+        </w:numPr>
+        <w:spacing w:after="80"/>
+      </w:pPr>
+      <w:r>
+        <w:t xml:space="preserve">The status line shows when the session expires. If it reads "Session expired", sign in again — sessions do not last indefinitely.</w:t>
+      </w:r>
+    </w:p>
+    <w:p>
+      <w:pPr>
+        <w:pStyle w:val="ListParagraph"/>
+        <w:numPr>
+          <w:ilvl w:val="0"/>
+          <w:numId w:val="3"/>
+        </w:numPr>
+        <w:spacing w:after="80"/>
+      </w:pPr>
+      <w:r>
+        <w:t xml:space="preserve">Tell-tale sign you are not connected: owner names read "Blurred" and comps will not load.</w:t>
       </w:r>
     </w:p>
     <w:p>
@@ -1336,20 +1409,20 @@
         <w:spacing w:after="80"/>
       </w:pPr>
       <w:r>
-        <w:t xml:space="preserve">Table view: sortable columns, status, route badge, entitlement pill.</w:t>
-      </w:r>
-    </w:p>
-    <w:p>
-      <w:pPr>
-        <w:pStyle w:val="ListParagraph"/>
-        <w:numPr>
-          <w:ilvl w:val="0"/>
-          <w:numId w:val="3"/>
-        </w:numPr>
-        <w:spacing w:after="80"/>
-      </w:pPr>
-      <w:r>
-        <w:t xml:space="preserve">Cards view: better on phone — acreage, comp band, bottleneck flag.</w:t>
+        <w:t xml:space="preserve">Table view: columns for address, county, acres, $/acre, status, and route.</w:t>
+      </w:r>
+    </w:p>
+    <w:p>
+      <w:pPr>
+        <w:pStyle w:val="ListParagraph"/>
+        <w:numPr>
+          <w:ilvl w:val="0"/>
+          <w:numId w:val="3"/>
+        </w:numPr>
+        <w:spacing w:after="80"/>
+      </w:pPr>
+      <w:r>
+        <w:t xml:space="preserve">Board view: Trello-style cards you can drag between stages — also the easier view on a phone.</w:t>
       </w:r>
     </w:p>
     <w:p>
@@ -1367,6 +1440,19 @@
     </w:p>
     <w:p>
       <w:pPr>
+        <w:pStyle w:val="ListParagraph"/>
+        <w:numPr>
+          <w:ilvl w:val="0"/>
+          <w:numId w:val="3"/>
+        </w:numPr>
+        <w:spacing w:after="80"/>
+      </w:pPr>
+      <w:r>
+        <w:t xml:space="preserve">Search covers address, portfolio, owner, tags, and notes. Filter by county, route, or portfolio.</w:t>
+      </w:r>
+    </w:p>
+    <w:p>
+      <w:pPr>
         <w:pStyle w:val="Heading3"/>
       </w:pPr>
       <w:r>
@@ -1511,46 +1597,46 @@
         <w:spacing w:after="120"/>
       </w:pPr>
       <w:r>
-        <w:t xml:space="preserve">Every deal gets a route — use the dropdown on the card or in the modal.</w:t>
-      </w:r>
-    </w:p>
-    <w:p>
-      <w:pPr>
-        <w:pStyle w:val="ListParagraph"/>
-        <w:numPr>
-          <w:ilvl w:val="0"/>
-          <w:numId w:val="3"/>
-        </w:numPr>
-        <w:spacing w:after="80"/>
-      </w:pPr>
-      <w:r>
-        <w:t xml:space="preserve">Develop / Entitle: sewer/utilities and builder spillover support entitlement plays</w:t>
-      </w:r>
-    </w:p>
-    <w:p>
-      <w:pPr>
-        <w:pStyle w:val="ListParagraph"/>
-        <w:numPr>
-          <w:ilvl w:val="0"/>
-          <w:numId w:val="3"/>
-        </w:numPr>
-        <w:spacing w:after="80"/>
-      </w:pPr>
-      <w:r>
-        <w:t xml:space="preserve">Sell (Flip): comp-supported acquisition where entitlement is the bottleneck</w:t>
-      </w:r>
-    </w:p>
-    <w:p>
-      <w:pPr>
-        <w:pStyle w:val="ListParagraph"/>
-        <w:numPr>
-          <w:ilvl w:val="0"/>
-          <w:numId w:val="3"/>
-        </w:numPr>
-        <w:spacing w:after="80"/>
-      </w:pPr>
-      <w:r>
-        <w:t xml:space="preserve">Retail: smaller tracts or straight brokerage/listing plays</w:t>
+        <w:t xml:space="preserve">Every deal gets a route. On the Silos tab, drag a card between lanes to assign it — the deal updates as soon as you drop it. You can also set the route from the deal modal.</w:t>
+      </w:r>
+    </w:p>
+    <w:p>
+      <w:pPr>
+        <w:pStyle w:val="ListParagraph"/>
+        <w:numPr>
+          <w:ilvl w:val="0"/>
+          <w:numId w:val="3"/>
+        </w:numPr>
+        <w:spacing w:after="80"/>
+      </w:pPr>
+      <w:r>
+        <w:t xml:space="preserve">Development &amp; Entitlement: sewer/utilities and builder spillover support entitlement plays</w:t>
+      </w:r>
+    </w:p>
+    <w:p>
+      <w:pPr>
+        <w:pStyle w:val="ListParagraph"/>
+        <w:numPr>
+          <w:ilvl w:val="0"/>
+          <w:numId w:val="3"/>
+        </w:numPr>
+        <w:spacing w:after="80"/>
+      </w:pPr>
+      <w:r>
+        <w:t xml:space="preserve">Direct Sale: comp-supported acquisition where sewer or entitlement is the bottleneck</w:t>
+      </w:r>
+    </w:p>
+    <w:p>
+      <w:pPr>
+        <w:pStyle w:val="ListParagraph"/>
+        <w:numPr>
+          <w:ilvl w:val="0"/>
+          <w:numId w:val="3"/>
+        </w:numPr>
+        <w:spacing w:after="80"/>
+      </w:pPr>
+      <w:r>
+        <w:t xml:space="preserve">Retail Brokerage: smaller tracts or straight brokerage/listing plays</w:t>
       </w:r>
     </w:p>
     <w:p>
@@ -1558,7 +1644,7 @@
         <w:spacing w:after="120"/>
       </w:pPr>
       <w:r>
-        <w:t xml:space="preserve">Silos tab shows lane counts and total acres. Entitlement-bottlenecked tracts are excluded from outreach queues.</w:t>
+        <w:t xml:space="preserve">Each lane header shows its deal count and total acres. Entitlement-bottlenecked tracts are excluded from outreach queues automatically.</w:t>
       </w:r>
     </w:p>
     <w:p>
@@ -2330,7 +2416,20 @@
         <w:spacing w:after="80"/>
       </w:pPr>
       <w:r>
-        <w:t xml:space="preserve">Feature Request: submit product ideas from the header.</w:t>
+        <w:t xml:space="preserve">Feature Request: submit product ideas from the header — you can attach screenshots or a PDF.</w:t>
+      </w:r>
+    </w:p>
+    <w:p>
+      <w:pPr>
+        <w:pStyle w:val="ListParagraph"/>
+        <w:numPr>
+          <w:ilvl w:val="0"/>
+          <w:numId w:val="3"/>
+        </w:numPr>
+        <w:spacing w:after="80"/>
+      </w:pPr>
+      <w:r>
+        <w:t xml:space="preserve">How to Use: the header button opens a short in-app version of this guide, so nobody has to find this file.</w:t>
       </w:r>
     </w:p>
     <w:p>
@@ -2427,7 +2526,7 @@
         <w:spacing w:after="120"/>
       </w:pPr>
       <w:r>
-        <w:t xml:space="preserve">Intake counties include Williamson, Travis, Bastrop, Caldwell, Hays, Comal, Bexar, Guadalupe, Fort Bend, Smith (Tyler), and more.</w:t>
+        <w:t xml:space="preserve">The Intake county dropdown currently covers 16 counties: Williamson, Travis, Bastrop, Caldwell, Hays, Comal, Bexar, Guadalupe, Gillespie, Blanco, Burnet, Bandera, Kendall, Llano, Fort Bend, and Smith (Tyler).</w:t>
       </w:r>
     </w:p>
     <w:p>
@@ -3029,7 +3128,7 @@
                 <w:b w:val="false"/>
                 <w:bCs w:val="false"/>
               </w:rPr>
-              <w:t xml:space="preserve">Cloud Sync not configured</w:t>
+              <w:t xml:space="preserve">Owner name shows "Blurred"</w:t>
             </w:r>
           </w:p>
         </w:tc>
@@ -3056,7 +3155,7 @@
                 <w:b w:val="false"/>
                 <w:bCs w:val="false"/>
               </w:rPr>
-              <w:t xml:space="preserve">Supabase env vars missing on Vercel — use Export/Import Bundle offline</w:t>
+              <w:t xml:space="preserve">id.land not connected, or that session expired — re-sign in on the Intake panel</w:t>
             </w:r>
           </w:p>
         </w:tc>
@@ -3085,7 +3184,7 @@
                 <w:b w:val="false"/>
                 <w:bCs w:val="false"/>
               </w:rPr>
-              <w:t xml:space="preserve">Enrichment shows MOCK</w:t>
+              <w:t xml:space="preserve">id.land says "Session expired"</w:t>
             </w:r>
           </w:p>
         </w:tc>
@@ -3112,7 +3211,7 @@
                 <w:b w:val="false"/>
                 <w:bCs w:val="false"/>
               </w:rPr>
-              <w:t xml:space="preserve">Connect id.land token; some counties use mock profile until CAD REST is wired</w:t>
+              <w:t xml:space="preserve">Normal — access tokens lapse. Enter email and password again</w:t>
             </w:r>
           </w:p>
         </w:tc>
@@ -3141,7 +3240,7 @@
                 <w:b w:val="false"/>
                 <w:bCs w:val="false"/>
               </w:rPr>
-              <w:t xml:space="preserve">Deal excluded from outreach</w:t>
+              <w:t xml:space="preserve">Comps will not load</w:t>
             </w:r>
           </w:p>
         </w:tc>
@@ -3168,7 +3267,7 @@
                 <w:b w:val="false"/>
                 <w:bCs w:val="false"/>
               </w:rPr>
-              <w:t xml:space="preserve">Entitlement bottleneck or missing owner contact</w:t>
+              <w:t xml:space="preserve">Same cause: check the id.land status line is green</w:t>
             </w:r>
           </w:p>
         </w:tc>
@@ -3197,7 +3296,7 @@
                 <w:b w:val="false"/>
                 <w:bCs w:val="false"/>
               </w:rPr>
-              <w:t xml:space="preserve">DNC scrub failed</w:t>
+              <w:t xml:space="preserve">Cloud Sync not configured</w:t>
             </w:r>
           </w:p>
         </w:tc>
@@ -3224,7 +3323,7 @@
                 <w:b w:val="false"/>
                 <w:bCs w:val="false"/>
               </w:rPr>
-              <w:t xml:space="preserve">Set DNC_SCRUB_API_KEY or use direct mail instead</w:t>
+              <w:t xml:space="preserve">Supabase env vars missing on Vercel — use Export/Import Bundle offline</w:t>
             </w:r>
           </w:p>
         </w:tc>
@@ -3253,7 +3352,7 @@
                 <w:b w:val="false"/>
                 <w:bCs w:val="false"/>
               </w:rPr>
-              <w:t xml:space="preserve">Text blocked after scrub</w:t>
+              <w:t xml:space="preserve">Enrichment shows MOCK</w:t>
             </w:r>
           </w:p>
         </w:tc>
@@ -3280,7 +3379,7 @@
                 <w:b w:val="false"/>
                 <w:bCs w:val="false"/>
               </w:rPr>
-              <w:t xml:space="preserve">Number on DNC list — use mail, do not text</w:t>
+              <w:t xml:space="preserve">Connect id.land token; some counties use mock profile until CAD REST is wired</w:t>
             </w:r>
           </w:p>
         </w:tc>
@@ -3309,7 +3408,7 @@
                 <w:b w:val="false"/>
                 <w:bCs w:val="false"/>
               </w:rPr>
-              <w:t xml:space="preserve">Website lead not showing</w:t>
+              <w:t xml:space="preserve">Deal excluded from outreach</w:t>
             </w:r>
           </w:p>
         </w:tc>
@@ -3336,7 +3435,7 @@
                 <w:b w:val="false"/>
                 <w:bCs w:val="false"/>
               </w:rPr>
-              <w:t xml:space="preserve">Click Website Leads Refresh on Intake or Intel</w:t>
+              <w:t xml:space="preserve">Entitlement bottleneck or missing owner contact</w:t>
             </w:r>
           </w:p>
         </w:tc>
@@ -3365,7 +3464,7 @@
                 <w:b w:val="false"/>
                 <w:bCs w:val="false"/>
               </w:rPr>
-              <w:t xml:space="preserve">Stale UI after update</w:t>
+              <w:t xml:space="preserve">DNC scrub failed</w:t>
             </w:r>
           </w:p>
         </w:tc>
@@ -3392,7 +3491,7 @@
                 <w:b w:val="false"/>
                 <w:bCs w:val="false"/>
               </w:rPr>
-              <w:t xml:space="preserve">Hard refresh: Cmd+Shift+R (Mac) or Ctrl+Shift+R (Windows)</w:t>
+              <w:t xml:space="preserve">Set DNC_SCRUB_API_KEY or use direct mail instead</w:t>
             </w:r>
           </w:p>
         </w:tc>
@@ -3421,6 +3520,174 @@
                 <w:b w:val="false"/>
                 <w:bCs w:val="false"/>
               </w:rPr>
+              <w:t xml:space="preserve">Text blocked after scrub</w:t>
+            </w:r>
+          </w:p>
+        </w:tc>
+        <w:tc>
+          <w:tcPr>
+            <w:tcW w:type="dxa" w:w="6560"/>
+            <w:tcBorders>
+              <w:top w:val="single" w:color="CCCCCC" w:sz="1"/>
+              <w:left w:val="single" w:color="CCCCCC" w:sz="1"/>
+              <w:bottom w:val="single" w:color="CCCCCC" w:sz="1"/>
+              <w:right w:val="single" w:color="CCCCCC" w:sz="1"/>
+            </w:tcBorders>
+            <w:shd w:fill="FFFFFF" w:val="clear"/>
+            <w:tcMar>
+              <w:top w:type="dxa" w:w="80"/>
+              <w:left w:type="dxa" w:w="120"/>
+              <w:bottom w:type="dxa" w:w="80"/>
+              <w:right w:type="dxa" w:w="120"/>
+            </w:tcMar>
+          </w:tcPr>
+          <w:p>
+            <w:r>
+              <w:rPr>
+                <w:b w:val="false"/>
+                <w:bCs w:val="false"/>
+              </w:rPr>
+              <w:t xml:space="preserve">Number on DNC list — use mail, do not text</w:t>
+            </w:r>
+          </w:p>
+        </w:tc>
+      </w:tr>
+      <w:tr>
+        <w:tc>
+          <w:tcPr>
+            <w:tcW w:type="dxa" w:w="2800"/>
+            <w:tcBorders>
+              <w:top w:val="single" w:color="CCCCCC" w:sz="1"/>
+              <w:left w:val="single" w:color="CCCCCC" w:sz="1"/>
+              <w:bottom w:val="single" w:color="CCCCCC" w:sz="1"/>
+              <w:right w:val="single" w:color="CCCCCC" w:sz="1"/>
+            </w:tcBorders>
+            <w:shd w:fill="FFFFFF" w:val="clear"/>
+            <w:tcMar>
+              <w:top w:type="dxa" w:w="80"/>
+              <w:left w:type="dxa" w:w="120"/>
+              <w:bottom w:type="dxa" w:w="80"/>
+              <w:right w:type="dxa" w:w="120"/>
+            </w:tcMar>
+          </w:tcPr>
+          <w:p>
+            <w:r>
+              <w:rPr>
+                <w:b w:val="false"/>
+                <w:bCs w:val="false"/>
+              </w:rPr>
+              <w:t xml:space="preserve">Website lead not showing</w:t>
+            </w:r>
+          </w:p>
+        </w:tc>
+        <w:tc>
+          <w:tcPr>
+            <w:tcW w:type="dxa" w:w="6560"/>
+            <w:tcBorders>
+              <w:top w:val="single" w:color="CCCCCC" w:sz="1"/>
+              <w:left w:val="single" w:color="CCCCCC" w:sz="1"/>
+              <w:bottom w:val="single" w:color="CCCCCC" w:sz="1"/>
+              <w:right w:val="single" w:color="CCCCCC" w:sz="1"/>
+            </w:tcBorders>
+            <w:shd w:fill="FFFFFF" w:val="clear"/>
+            <w:tcMar>
+              <w:top w:type="dxa" w:w="80"/>
+              <w:left w:type="dxa" w:w="120"/>
+              <w:bottom w:type="dxa" w:w="80"/>
+              <w:right w:type="dxa" w:w="120"/>
+            </w:tcMar>
+          </w:tcPr>
+          <w:p>
+            <w:r>
+              <w:rPr>
+                <w:b w:val="false"/>
+                <w:bCs w:val="false"/>
+              </w:rPr>
+              <w:t xml:space="preserve">Click Website Leads Refresh on Intake or Intel</w:t>
+            </w:r>
+          </w:p>
+        </w:tc>
+      </w:tr>
+      <w:tr>
+        <w:tc>
+          <w:tcPr>
+            <w:tcW w:type="dxa" w:w="2800"/>
+            <w:tcBorders>
+              <w:top w:val="single" w:color="CCCCCC" w:sz="1"/>
+              <w:left w:val="single" w:color="CCCCCC" w:sz="1"/>
+              <w:bottom w:val="single" w:color="CCCCCC" w:sz="1"/>
+              <w:right w:val="single" w:color="CCCCCC" w:sz="1"/>
+            </w:tcBorders>
+            <w:shd w:fill="FFFFFF" w:val="clear"/>
+            <w:tcMar>
+              <w:top w:type="dxa" w:w="80"/>
+              <w:left w:type="dxa" w:w="120"/>
+              <w:bottom w:type="dxa" w:w="80"/>
+              <w:right w:type="dxa" w:w="120"/>
+            </w:tcMar>
+          </w:tcPr>
+          <w:p>
+            <w:r>
+              <w:rPr>
+                <w:b w:val="false"/>
+                <w:bCs w:val="false"/>
+              </w:rPr>
+              <w:t xml:space="preserve">Stale UI after update</w:t>
+            </w:r>
+          </w:p>
+        </w:tc>
+        <w:tc>
+          <w:tcPr>
+            <w:tcW w:type="dxa" w:w="6560"/>
+            <w:tcBorders>
+              <w:top w:val="single" w:color="CCCCCC" w:sz="1"/>
+              <w:left w:val="single" w:color="CCCCCC" w:sz="1"/>
+              <w:bottom w:val="single" w:color="CCCCCC" w:sz="1"/>
+              <w:right w:val="single" w:color="CCCCCC" w:sz="1"/>
+            </w:tcBorders>
+            <w:shd w:fill="FFFFFF" w:val="clear"/>
+            <w:tcMar>
+              <w:top w:type="dxa" w:w="80"/>
+              <w:left w:type="dxa" w:w="120"/>
+              <w:bottom w:type="dxa" w:w="80"/>
+              <w:right w:type="dxa" w:w="120"/>
+            </w:tcMar>
+          </w:tcPr>
+          <w:p>
+            <w:r>
+              <w:rPr>
+                <w:b w:val="false"/>
+                <w:bCs w:val="false"/>
+              </w:rPr>
+              <w:t xml:space="preserve">Hard refresh: Cmd+Shift+R (Mac) or Ctrl+Shift+R (Windows)</w:t>
+            </w:r>
+          </w:p>
+        </w:tc>
+      </w:tr>
+      <w:tr>
+        <w:tc>
+          <w:tcPr>
+            <w:tcW w:type="dxa" w:w="2800"/>
+            <w:tcBorders>
+              <w:top w:val="single" w:color="CCCCCC" w:sz="1"/>
+              <w:left w:val="single" w:color="CCCCCC" w:sz="1"/>
+              <w:bottom w:val="single" w:color="CCCCCC" w:sz="1"/>
+              <w:right w:val="single" w:color="CCCCCC" w:sz="1"/>
+            </w:tcBorders>
+            <w:shd w:fill="FFFFFF" w:val="clear"/>
+            <w:tcMar>
+              <w:top w:type="dxa" w:w="80"/>
+              <w:left w:type="dxa" w:w="120"/>
+              <w:bottom w:type="dxa" w:w="80"/>
+              <w:right w:type="dxa" w:w="120"/>
+            </w:tcMar>
+          </w:tcPr>
+          <w:p>
+            <w:r>
+              <w:rPr>
+                <w:b w:val="false"/>
+                <w:bCs w:val="false"/>
+              </w:rPr>
               <w:t xml:space="preserve">www vs apex domain</w:t>
             </w:r>
           </w:p>
@@ -3680,7 +3947,7 @@
       <w:r>
         <w:t xml:space="preserve">Sign in at </w:t>
       </w:r>
-      <w:hyperlink w:history="1" r:id="rIdsjauovt0w30fx9lj29enn">
+      <w:hyperlink w:history="1" r:id="rId_3w-_2zh8bpvyhmlntkyz">
         <w:r>
           <w:rPr>
             <w:rStyle w:val="Hyperlink"/>

</xml_diff>

<commit_message>
Serve the operator training to the team at /training
The infographic only existed as a local file, so the only way to share it was
to email the HTML around. docs/ is excluded by .vercelignore, and un-ignoring
it would have published the pitch deck, value model, and Jack's presentation
instructions to guessable public URLs — so move this one file to the root
instead of opening that directory up.

Gated with the staff password rather than served publicly: the training
describes internal workflow, comp-lake strategy, and who to send deals to.
Added to isProtectedPath and the middleware matcher, deliberately not to
isAppRoute so it is not rewritten into the staff app. Cached no-store like
/app so edits reach the team immediately.

Reachable from Operator Training in the How to Use drawer, or barntobank.com
/training directly.

Co-Authored-By: Claude Opus 5 (1M context) <noreply@anthropic.com>
</commit_message>
<xml_diff>
--- a/docs/Barn-to-Bank-How-To.docx
+++ b/docs/Barn-to-Bank-How-To.docx
@@ -37,7 +37,7 @@
       <w:r>
         <w:t xml:space="preserve">Staff app: </w:t>
       </w:r>
-      <w:hyperlink w:history="1" r:id="rIdyyfkqxubqscltc6btbfom">
+      <w:hyperlink w:history="1" r:id="rIdpu7gm_pwvb0ms5e3lhfyk">
         <w:r>
           <w:rPr>
             <w:rStyle w:val="Hyperlink"/>
@@ -55,7 +55,7 @@
       <w:r>
         <w:t xml:space="preserve">Public site: </w:t>
       </w:r>
-      <w:hyperlink w:history="1" r:id="rIdqqoj8y4w8u_usvl2zte7y">
+      <w:hyperlink w:history="1" r:id="rIdk7hel64t08jsjwiksdeel">
         <w:r>
           <w:rPr>
             <w:rStyle w:val="Hyperlink"/>
@@ -431,7 +431,98 @@
           </w:p>
         </w:tc>
       </w:tr>
+      <w:tr>
+        <w:tc>
+          <w:tcPr>
+            <w:tcW w:type="dxa" w:w="2200"/>
+            <w:tcBorders>
+              <w:top w:val="single" w:color="CCCCCC" w:sz="1"/>
+              <w:left w:val="single" w:color="CCCCCC" w:sz="1"/>
+              <w:bottom w:val="single" w:color="CCCCCC" w:sz="1"/>
+              <w:right w:val="single" w:color="CCCCCC" w:sz="1"/>
+            </w:tcBorders>
+            <w:shd w:fill="FFFFFF" w:val="clear"/>
+            <w:tcMar>
+              <w:top w:type="dxa" w:w="80"/>
+              <w:left w:type="dxa" w:w="120"/>
+              <w:bottom w:type="dxa" w:w="80"/>
+              <w:right w:type="dxa" w:w="120"/>
+            </w:tcMar>
+          </w:tcPr>
+          <w:p>
+            <w:r>
+              <w:rPr>
+                <w:b w:val="false"/>
+                <w:bCs w:val="false"/>
+              </w:rPr>
+              <w:t xml:space="preserve">Operator training</w:t>
+            </w:r>
+          </w:p>
+        </w:tc>
+        <w:tc>
+          <w:tcPr>
+            <w:tcW w:type="dxa" w:w="3000"/>
+            <w:tcBorders>
+              <w:top w:val="single" w:color="CCCCCC" w:sz="1"/>
+              <w:left w:val="single" w:color="CCCCCC" w:sz="1"/>
+              <w:bottom w:val="single" w:color="CCCCCC" w:sz="1"/>
+              <w:right w:val="single" w:color="CCCCCC" w:sz="1"/>
+            </w:tcBorders>
+            <w:shd w:fill="FFFFFF" w:val="clear"/>
+            <w:tcMar>
+              <w:top w:type="dxa" w:w="80"/>
+              <w:left w:type="dxa" w:w="120"/>
+              <w:bottom w:type="dxa" w:w="80"/>
+              <w:right w:type="dxa" w:w="120"/>
+            </w:tcMar>
+          </w:tcPr>
+          <w:p>
+            <w:r>
+              <w:rPr>
+                <w:b w:val="false"/>
+                <w:bCs w:val="false"/>
+              </w:rPr>
+              <w:t xml:space="preserve">https://barntobank.com/training</w:t>
+            </w:r>
+          </w:p>
+        </w:tc>
+        <w:tc>
+          <w:tcPr>
+            <w:tcW w:type="dxa" w:w="4160"/>
+            <w:tcBorders>
+              <w:top w:val="single" w:color="CCCCCC" w:sz="1"/>
+              <w:left w:val="single" w:color="CCCCCC" w:sz="1"/>
+              <w:bottom w:val="single" w:color="CCCCCC" w:sz="1"/>
+              <w:right w:val="single" w:color="CCCCCC" w:sz="1"/>
+            </w:tcBorders>
+            <w:shd w:fill="FFFFFF" w:val="clear"/>
+            <w:tcMar>
+              <w:top w:type="dxa" w:w="80"/>
+              <w:left w:type="dxa" w:w="120"/>
+              <w:bottom w:type="dxa" w:w="80"/>
+              <w:right w:type="dxa" w:w="120"/>
+            </w:tcMar>
+          </w:tcPr>
+          <w:p>
+            <w:r>
+              <w:rPr>
+                <w:b w:val="false"/>
+                <w:bCs w:val="false"/>
+              </w:rPr>
+              <w:t xml:space="preserve">Staff — behind the same password as the app</w:t>
+            </w:r>
+          </w:p>
+        </w:tc>
+      </w:tr>
     </w:tbl>
+    <w:p>
+      <w:pPr>
+        <w:spacing w:after="120"/>
+      </w:pPr>
+      <w:r>
+        <w:t xml:space="preserve">Visual operator training lives at https://barntobank.com/training, or press How to Use inside the app. It is gated with the staff password because it describes internal workflow and comp strategy — do not send that link to anyone outside the team.</w:t>
+      </w:r>
+    </w:p>
     <w:p>
       <w:pPr>
         <w:pStyle w:val="Heading1"/>
@@ -3947,7 +4038,7 @@
       <w:r>
         <w:t xml:space="preserve">Sign in at </w:t>
       </w:r>
-      <w:hyperlink w:history="1" r:id="rId_3w-_2zh8bpvyhmlntkyz">
+      <w:hyperlink w:history="1" r:id="rIdyscy5ekncurkzfyrq5t6u">
         <w:r>
           <w:rPr>
             <w:rStyle w:val="Hyperlink"/>

</xml_diff>

<commit_message>
Point everything at barntobanklandgroup.com
The new domain is registered at Porkbun and now resolves to Vercel with a
certificate issued, so switch the 26 hardcoded references across the staff app,
the operator training page, the doc generators, and the two email templates.

The public site needed no changes at all — index.html uses relative paths
throughout, so it was already domain-agnostic.

Contrary to what I said earlier, this fixes the defaults in the email libraries
rather than introducing LEAD_APP_URL / FEATURE_REQUEST_APP_URL env vars. The
env override seam is still there if a future rename wants config instead of
code, but splitting the truth across two places for a value that is now correct
in code is the worse trade.

Word docs regenerated. barntobank.com keeps working; the redirect lands next so
there is never a window where a sent link points at a host that does not serve.

Co-Authored-By: Claude Opus 5 (1M context) <noreply@anthropic.com>
</commit_message>
<xml_diff>
--- a/docs/Barn-to-Bank-How-To.docx
+++ b/docs/Barn-to-Bank-How-To.docx
@@ -37,14 +37,14 @@
       <w:r>
         <w:t xml:space="preserve">Staff app: </w:t>
       </w:r>
-      <w:hyperlink w:history="1" r:id="rIdpu7gm_pwvb0ms5e3lhfyk">
+      <w:hyperlink w:history="1" r:id="rIdt0bbdyaqglnpkp1_5xcsb">
         <w:r>
           <w:rPr>
             <w:rStyle w:val="Hyperlink"/>
             <w:color w:val="0563C1"/>
             <w:u w:val="single"/>
           </w:rPr>
-          <w:t xml:space="preserve">https://barntobank.com/app</w:t>
+          <w:t xml:space="preserve">https://barntobanklandgroup.com/app</w:t>
         </w:r>
       </w:hyperlink>
     </w:p>
@@ -55,14 +55,14 @@
       <w:r>
         <w:t xml:space="preserve">Public site: </w:t>
       </w:r>
-      <w:hyperlink w:history="1" r:id="rIdk7hel64t08jsjwiksdeel">
+      <w:hyperlink w:history="1" r:id="rIdz0idqvk2is41uccvvwqr8">
         <w:r>
           <w:rPr>
             <w:rStyle w:val="Hyperlink"/>
             <w:color w:val="0563C1"/>
             <w:u w:val="single"/>
           </w:rPr>
-          <w:t xml:space="preserve">https://barntobank.com</w:t>
+          <w:t xml:space="preserve">https://barntobanklandgroup.com</w:t>
         </w:r>
       </w:hyperlink>
     </w:p>
@@ -233,7 +233,7 @@
                 <w:b w:val="false"/>
                 <w:bCs w:val="false"/>
               </w:rPr>
-              <w:t xml:space="preserve">https://barntobank.com</w:t>
+              <w:t xml:space="preserve">https://barntobanklandgroup.com</w:t>
             </w:r>
           </w:p>
         </w:tc>
@@ -316,7 +316,7 @@
                 <w:b w:val="false"/>
                 <w:bCs w:val="false"/>
               </w:rPr>
-              <w:t xml:space="preserve">https://barntobank.com/app</w:t>
+              <w:t xml:space="preserve">https://barntobanklandgroup.com/app</w:t>
             </w:r>
           </w:p>
         </w:tc>
@@ -399,7 +399,7 @@
                 <w:b w:val="false"/>
                 <w:bCs w:val="false"/>
               </w:rPr>
-              <w:t xml:space="preserve">https://barntobank.com/app/login</w:t>
+              <w:t xml:space="preserve">https://barntobanklandgroup.com/app/login</w:t>
             </w:r>
           </w:p>
         </w:tc>
@@ -482,7 +482,7 @@
                 <w:b w:val="false"/>
                 <w:bCs w:val="false"/>
               </w:rPr>
-              <w:t xml:space="preserve">https://barntobank.com/training</w:t>
+              <w:t xml:space="preserve">https://barntobanklandgroup.com/training</w:t>
             </w:r>
           </w:p>
         </w:tc>
@@ -520,7 +520,7 @@
         <w:spacing w:after="120"/>
       </w:pPr>
       <w:r>
-        <w:t xml:space="preserve">Visual operator training lives at https://barntobank.com/training, or press How to Use inside the app. It is gated with the staff password because it describes internal workflow and comp strategy — do not send that link to anyone outside the team.</w:t>
+        <w:t xml:space="preserve">Visual operator training lives at https://barntobanklandgroup.com/training, or press How to Use inside the app. It is gated with the staff password because it describes internal workflow and comp strategy — do not send that link to anyone outside the team.</w:t>
       </w:r>
     </w:p>
     <w:p>
@@ -549,7 +549,7 @@
         <w:spacing w:after="80"/>
       </w:pPr>
       <w:r>
-        <w:t xml:space="preserve">Go to https://barntobank.com/app and sign in with the origination password.</w:t>
+        <w:t xml:space="preserve">Go to https://barntobanklandgroup.com/app and sign in with the origination password.</w:t>
       </w:r>
     </w:p>
     <w:p>
@@ -687,7 +687,7 @@
         <w:spacing w:after="80"/>
       </w:pPr>
       <w:r>
-        <w:t xml:space="preserve">Staff app and APIs are protected. Bookmark https://barntobank.com/app/login if prompted.</w:t>
+        <w:t xml:space="preserve">Staff app and APIs are protected. Bookmark https://barntobanklandgroup.com/app/login if prompted.</w:t>
       </w:r>
     </w:p>
     <w:p>
@@ -2371,7 +2371,7 @@
         <w:spacing w:after="120"/>
       </w:pPr>
       <w:r>
-        <w:t xml:space="preserve">Same inbound leads from barntobank.com — refresh, review, and mark contacted/converted from Intel or Intake.</w:t>
+        <w:t xml:space="preserve">Same inbound leads from barntobanklandgroup.com — refresh, review, and mark contacted/converted from Intel or Intake.</w:t>
       </w:r>
     </w:p>
     <w:p>
@@ -2468,7 +2468,7 @@
         <w:spacing w:after="80"/>
       </w:pPr>
       <w:r>
-        <w:t xml:space="preserve">Copy App Link in header — sends partners to barntobank.com/app.</w:t>
+        <w:t xml:space="preserve">Copy App Link in header — sends partners to barntobanklandgroup.com/app.</w:t>
       </w:r>
     </w:p>
     <w:p>
@@ -2549,7 +2549,7 @@
         <w:spacing w:after="120"/>
       </w:pPr>
       <w:r>
-        <w:t xml:space="preserve">The public site at https://barntobank.com is separate from the staff app.</w:t>
+        <w:t xml:space="preserve">The public site at https://barntobanklandgroup.com is separate from the staff app.</w:t>
       </w:r>
     </w:p>
     <w:p>
@@ -2829,7 +2829,7 @@
                 <w:b w:val="false"/>
                 <w:bCs w:val="false"/>
               </w:rPr>
-              <w:t xml:space="preserve">Git push to main → Vercel auto-deploys to barntobank.com</w:t>
+              <w:t xml:space="preserve">Git push to main → Vercel auto-deploys to barntobanklandgroup.com</w:t>
             </w:r>
           </w:p>
         </w:tc>
@@ -3806,7 +3806,7 @@
                 <w:b w:val="false"/>
                 <w:bCs w:val="false"/>
               </w:rPr>
-              <w:t xml:space="preserve">Both barntobank.com and www.barntobank.com point to Vercel</w:t>
+              <w:t xml:space="preserve">Both barntobanklandgroup.com and www.barntobanklandgroup.com point to Vercel</w:t>
             </w:r>
           </w:p>
         </w:tc>
@@ -4038,14 +4038,14 @@
       <w:r>
         <w:t xml:space="preserve">Sign in at </w:t>
       </w:r>
-      <w:hyperlink w:history="1" r:id="rIdyscy5ekncurkzfyrq5t6u">
+      <w:hyperlink w:history="1" r:id="rIdgnkyla-yzlastpfjn8tye">
         <w:r>
           <w:rPr>
             <w:rStyle w:val="Hyperlink"/>
             <w:color w:val="0563C1"/>
             <w:u w:val="single"/>
           </w:rPr>
-          <w:t xml:space="preserve">https://barntobank.com/app/login</w:t>
+          <w:t xml:space="preserve">https://barntobanklandgroup.com/app/login</w:t>
         </w:r>
       </w:hyperlink>
       <w:r>

</xml_diff>